<commit_message>
Update Project Report document with latest changes
</commit_message>
<xml_diff>
--- a/docs/capstone-docs/Final Capstone project (May 13th) /project-report/Project-Report.docx
+++ b/docs/capstone-docs/Final Capstone project (May 13th) /project-report/Project-Report.docx
@@ -287,27 +287,67 @@
         <w:rPr>
           <w:rFonts w:ascii="inter" w:eastAsia="inter" w:hAnsi="inter" w:cs="inter"/>
         </w:rPr>
-        <w:t xml:space="preserve">SmartVision is an open-source robotic system leveraging Raspberry Pi 5, computer vision, and machine learning to automate physical-to-digital information organization. This report details its technical implementation, market relevance, and expansion potential, </w:t>
+        <w:t xml:space="preserve">SmartVision is an open-source robotic system leveraging Raspberry Pi </w:t>
+      </w:r>
+      <w:r>
+        <w:rPr>
+          <w:rFonts w:ascii="inter" w:eastAsia="inter" w:hAnsi="inter" w:cs="inter"/>
+        </w:rPr>
+        <w:t>4</w:t>
+      </w:r>
+      <w:r>
+        <w:rPr>
+          <w:rFonts w:ascii="inter" w:eastAsia="inter" w:hAnsi="inter" w:cs="inter"/>
+        </w:rPr>
+        <w:t xml:space="preserve">, computer vision, and machine learning to automate physical-to-digital information organization. This report details its technical implementation, market relevance, and expansion potential, </w:t>
       </w:r>
       <w:commentRangeStart w:id="0"/>
+      <w:commentRangeStart w:id="1"/>
       <w:r>
         <w:rPr>
           <w:rFonts w:ascii="inter" w:eastAsia="inter" w:hAnsi="inter" w:cs="inter"/>
         </w:rPr>
-        <w:t>demonstrating how $217 hardware achieves 84% of commercial vision system capabilities</w:t>
+        <w:t xml:space="preserve">demonstrating </w:t>
       </w:r>
       <w:r>
         <w:rPr>
           <w:rFonts w:ascii="inter" w:eastAsia="inter" w:hAnsi="inter" w:cs="inter"/>
         </w:rPr>
+        <w:t xml:space="preserve">the technical prowess of </w:t>
+      </w:r>
+      <w:r>
+        <w:rPr>
+          <w:rFonts w:ascii="inter" w:eastAsia="inter" w:hAnsi="inter" w:cs="inter"/>
+        </w:rPr>
+        <w:t xml:space="preserve">the small, inexpensive microcontroller which </w:t>
+      </w:r>
+      <w:proofErr w:type="gramStart"/>
+      <w:r>
+        <w:rPr>
+          <w:rFonts w:ascii="inter" w:eastAsia="inter" w:hAnsi="inter" w:cs="inter"/>
+        </w:rPr>
+        <w:t xml:space="preserve">is </w:t>
+      </w:r>
+      <w:r>
+        <w:rPr>
+          <w:rFonts w:ascii="inter" w:eastAsia="inter" w:hAnsi="inter" w:cs="inter"/>
+        </w:rPr>
         <w:t>.</w:t>
       </w:r>
       <w:commentRangeEnd w:id="0"/>
+      <w:proofErr w:type="gramEnd"/>
       <w:r>
         <w:rPr>
           <w:rStyle w:val="CommentReference"/>
         </w:rPr>
         <w:commentReference w:id="0"/>
+      </w:r>
+      <w:commentRangeEnd w:id="1"/>
+      <w:r>
+        <w:rPr>
+          <w:rStyle w:val="CommentReference"/>
+        </w:rPr>
+        <w:commentReference w:id="1"/>
       </w:r>
     </w:p>
     <w:p>
@@ -381,28 +421,49 @@
       <w:pPr>
         <w:spacing w:before="315" w:after="105" w:line="360" w:lineRule="auto"/>
         <w:ind w:left="-30"/>
-      </w:pPr>
-      <w:r>
         <w:rPr>
           <w:rFonts w:ascii="inter" w:eastAsia="inter" w:hAnsi="inter" w:cs="inter"/>
           <w:b/>
           <w:sz w:val="24"/>
         </w:rPr>
-        <w:t>Technical Architecture</w:t>
-      </w:r>
+      </w:pPr>
     </w:p>
     <w:p>
       <w:pPr>
         <w:spacing w:before="315" w:after="105" w:line="360" w:lineRule="auto"/>
         <w:ind w:left="-30"/>
-      </w:pPr>
-      <w:r>
         <w:rPr>
           <w:rFonts w:ascii="inter" w:eastAsia="inter" w:hAnsi="inter" w:cs="inter"/>
           <w:b/>
           <w:sz w:val="24"/>
         </w:rPr>
-        <w:lastRenderedPageBreak/>
+      </w:pPr>
+    </w:p>
+    <w:p>
+      <w:pPr>
+        <w:spacing w:before="315" w:after="105" w:line="360" w:lineRule="auto"/>
+        <w:ind w:left="-30"/>
+      </w:pPr>
+      <w:r>
+        <w:rPr>
+          <w:rFonts w:ascii="inter" w:eastAsia="inter" w:hAnsi="inter" w:cs="inter"/>
+          <w:b/>
+          <w:sz w:val="24"/>
+        </w:rPr>
+        <w:t>Technical Architecture</w:t>
+      </w:r>
+    </w:p>
+    <w:p>
+      <w:pPr>
+        <w:spacing w:before="315" w:after="105" w:line="360" w:lineRule="auto"/>
+        <w:ind w:left="-30"/>
+      </w:pPr>
+      <w:r>
+        <w:rPr>
+          <w:rFonts w:ascii="inter" w:eastAsia="inter" w:hAnsi="inter" w:cs="inter"/>
+          <w:b/>
+          <w:sz w:val="24"/>
+        </w:rPr>
         <w:t>Hardware Stack</w:t>
       </w:r>
     </w:p>
@@ -521,7 +582,14 @@
                 <w:rFonts w:ascii="inter" w:eastAsia="inter" w:hAnsi="inter" w:cs="inter"/>
                 <w:sz w:val="17"/>
               </w:rPr>
-              <w:t>Raspberry Pi 5</w:t>
+              <w:t xml:space="preserve">Raspberry Pi </w:t>
+            </w:r>
+            <w:r>
+              <w:rPr>
+                <w:rFonts w:ascii="inter" w:eastAsia="inter" w:hAnsi="inter" w:cs="inter"/>
+                <w:sz w:val="17"/>
+              </w:rPr>
+              <w:t>4</w:t>
             </w:r>
           </w:p>
         </w:tc>
@@ -879,13 +947,8 @@
         </w:numPr>
         <w:spacing w:before="105" w:after="105" w:line="360" w:lineRule="auto"/>
       </w:pPr>
-      <w:proofErr w:type="spellStart"/>
-      <w:r>
-        <w:t>Roboflow</w:t>
-      </w:r>
-      <w:proofErr w:type="spellEnd"/>
-      <w:r>
-        <w:t xml:space="preserve">: </w:t>
+      <w:r>
+        <w:t xml:space="preserve">Roboflow: </w:t>
       </w:r>
     </w:p>
     <w:p>
@@ -916,7 +979,7 @@
       <w:pPr>
         <w:spacing w:after="210" w:line="360" w:lineRule="auto"/>
       </w:pPr>
-      <w:commentRangeStart w:id="1"/>
+      <w:commentRangeStart w:id="2"/>
       <w:r>
         <w:rPr>
           <w:rFonts w:ascii="inter" w:eastAsia="inter" w:hAnsi="inter" w:cs="inter"/>
@@ -1095,12 +1158,12 @@
         </w:rPr>
         <w:br/>
       </w:r>
-      <w:commentRangeEnd w:id="1"/>
+      <w:commentRangeEnd w:id="2"/>
       <w:r>
         <w:rPr>
           <w:rStyle w:val="CommentReference"/>
         </w:rPr>
-        <w:commentReference w:id="1"/>
+        <w:commentReference w:id="2"/>
       </w:r>
     </w:p>
     <w:p>
@@ -1518,6 +1581,7 @@
         <w:rPr>
           <w:rFonts w:ascii="inter" w:eastAsia="inter" w:hAnsi="inter" w:cs="inter"/>
         </w:rPr>
+        <w:lastRenderedPageBreak/>
         <w:t>Our solution addresses the 2.3 hours/week students waste manually transferring notes (SR14) through automated color-coded organization, shown to improve retention by 40% (SSRN Paper 14).</w:t>
       </w:r>
     </w:p>
@@ -8580,16 +8644,7 @@
         <w:spacing w:after="210" w:line="360" w:lineRule="auto"/>
       </w:pPr>
       <w:r>
-        <w:lastRenderedPageBreak/>
-        <w:t xml:space="preserve">New Updated </w:t>
-      </w:r>
-      <w:proofErr w:type="spellStart"/>
-      <w:r>
-        <w:t>Roboflow</w:t>
-      </w:r>
-      <w:proofErr w:type="spellEnd"/>
-      <w:r>
-        <w:t xml:space="preserve"> Models</w:t>
+        <w:t>New Updated Roboflow Models</w:t>
       </w:r>
     </w:p>
     <w:p>
@@ -9258,19 +9313,19 @@
       <w:pPr>
         <w:spacing w:after="210" w:line="360" w:lineRule="auto"/>
       </w:pPr>
-      <w:commentRangeStart w:id="2"/>
+      <w:commentRangeStart w:id="3"/>
       <w:r>
         <w:rPr>
           <w:rFonts w:ascii="inter" w:eastAsia="inter" w:hAnsi="inter" w:cs="inter"/>
         </w:rPr>
         <w:t>Training used 15,000 synthetic images from Blender with StyleGAN-ADA augmentations (Search Result 17).</w:t>
       </w:r>
-      <w:commentRangeEnd w:id="2"/>
+      <w:commentRangeEnd w:id="3"/>
       <w:r>
         <w:rPr>
           <w:rStyle w:val="CommentReference"/>
         </w:rPr>
-        <w:commentReference w:id="2"/>
+        <w:commentReference w:id="3"/>
       </w:r>
     </w:p>
     <w:p>
@@ -10189,70 +10244,673 @@
     </w:p>
     <w:p>
       <w:pPr>
+        <w:spacing w:before="315" w:after="105" w:line="360" w:lineRule="auto"/>
+        <w:ind w:left="-30"/>
+      </w:pPr>
+      <w:r>
+        <w:rPr>
+          <w:rFonts w:ascii="inter" w:eastAsia="inter" w:hAnsi="inter" w:cs="inter"/>
+          <w:b/>
+          <w:sz w:val="24"/>
+        </w:rPr>
+        <w:t>Why Our Solution Solves Critical Problems</w:t>
+      </w:r>
+    </w:p>
+    <w:p>
+      <w:pPr>
+        <w:spacing w:before="315" w:after="105" w:line="360" w:lineRule="auto"/>
+        <w:ind w:left="-30"/>
+      </w:pPr>
+      <w:r>
+        <w:rPr>
+          <w:rFonts w:ascii="inter" w:eastAsia="inter" w:hAnsi="inter" w:cs="inter"/>
+          <w:b/>
+          <w:sz w:val="24"/>
+        </w:rPr>
+        <w:t>Automated Physical-Digital Bridging</w:t>
+      </w:r>
+    </w:p>
+    <w:p>
+      <w:pPr>
         <w:spacing w:after="210" w:line="360" w:lineRule="auto"/>
+      </w:pPr>
+      <w:r>
         <w:rPr>
           <w:rFonts w:ascii="inter" w:eastAsia="inter" w:hAnsi="inter" w:cs="inter"/>
         </w:rPr>
+        <w:t>By training YOLOv8 models on Roboflow using a hybrid dataset of 15,000+ images (50% custom sticky notes + 50% Roboflow Universe public datasets), we achieve:</w:t>
+      </w:r>
+    </w:p>
+    <w:tbl>
+      <w:tblPr>
+        <w:tblStyle w:val="NormalGrid"/>
+        <w:tblW w:w="0" w:type="auto"/>
+        <w:jc w:val="center"/>
+        <w:tblCellSpacing w:w="0" w:type="dxa"/>
+        <w:tblBorders>
+          <w:top w:val="single" w:sz="2" w:space="0" w:color="000000"/>
+          <w:left w:val="single" w:sz="2" w:space="0" w:color="000000"/>
+          <w:bottom w:val="single" w:sz="2" w:space="0" w:color="000000"/>
+          <w:right w:val="single" w:sz="2" w:space="0" w:color="000000"/>
+        </w:tblBorders>
+        <w:tblLook w:val="04A0" w:firstRow="1" w:lastRow="0" w:firstColumn="1" w:lastColumn="0" w:noHBand="0" w:noVBand="1"/>
+      </w:tblPr>
+      <w:tblGrid>
+        <w:gridCol w:w="2045"/>
+        <w:gridCol w:w="2504"/>
+      </w:tblGrid>
+      <w:tr>
+        <w:trPr>
+          <w:cantSplit/>
+          <w:tblCellSpacing w:w="0" w:type="dxa"/>
+          <w:jc w:val="center"/>
+        </w:trPr>
+        <w:tc>
+          <w:tcPr>
+            <w:tcW w:w="0" w:type="auto"/>
+            <w:tcBorders>
+              <w:top w:val="single" w:sz="1" w:space="0" w:color="000000"/>
+              <w:bottom w:val="single" w:sz="1" w:space="0" w:color="000000"/>
+              <w:right w:val="single" w:sz="1" w:space="0" w:color="000000"/>
+            </w:tcBorders>
+          </w:tcPr>
+          <w:p>
+            <w:pPr>
+              <w:spacing w:line="360" w:lineRule="auto"/>
+            </w:pPr>
+            <w:r>
+              <w:rPr>
+                <w:rFonts w:ascii="inter" w:eastAsia="inter" w:hAnsi="inter" w:cs="inter"/>
+                <w:sz w:val="17"/>
+              </w:rPr>
+              <w:t>Metric</w:t>
+            </w:r>
+          </w:p>
+        </w:tc>
+        <w:tc>
+          <w:tcPr>
+            <w:tcW w:w="0" w:type="auto"/>
+            <w:tcBorders>
+              <w:top w:val="single" w:sz="1" w:space="0" w:color="000000"/>
+              <w:bottom w:val="single" w:sz="1" w:space="0" w:color="000000"/>
+            </w:tcBorders>
+          </w:tcPr>
+          <w:p>
+            <w:pPr>
+              <w:spacing w:line="360" w:lineRule="auto"/>
+            </w:pPr>
+            <w:r>
+              <w:rPr>
+                <w:rFonts w:ascii="inter" w:eastAsia="inter" w:hAnsi="inter" w:cs="inter"/>
+                <w:sz w:val="17"/>
+              </w:rPr>
+              <w:t>Performance</w:t>
+            </w:r>
+          </w:p>
+        </w:tc>
+      </w:tr>
+      <w:tr>
+        <w:trPr>
+          <w:cantSplit/>
+          <w:tblCellSpacing w:w="0" w:type="dxa"/>
+          <w:jc w:val="center"/>
+        </w:trPr>
+        <w:tc>
+          <w:tcPr>
+            <w:tcW w:w="0" w:type="auto"/>
+            <w:tcBorders>
+              <w:top w:val="single" w:sz="1" w:space="0" w:color="000000"/>
+              <w:bottom w:val="single" w:sz="1" w:space="0" w:color="000000"/>
+              <w:right w:val="single" w:sz="1" w:space="0" w:color="000000"/>
+            </w:tcBorders>
+          </w:tcPr>
+          <w:p>
+            <w:pPr>
+              <w:spacing w:line="360" w:lineRule="auto"/>
+            </w:pPr>
+            <w:r>
+              <w:rPr>
+                <w:rFonts w:ascii="inter" w:eastAsia="inter" w:hAnsi="inter" w:cs="inter"/>
+                <w:sz w:val="17"/>
+              </w:rPr>
+              <w:t>mAP50</w:t>
+            </w:r>
+          </w:p>
+        </w:tc>
+        <w:tc>
+          <w:tcPr>
+            <w:tcW w:w="0" w:type="auto"/>
+            <w:tcBorders>
+              <w:top w:val="single" w:sz="1" w:space="0" w:color="000000"/>
+              <w:bottom w:val="single" w:sz="1" w:space="0" w:color="000000"/>
+            </w:tcBorders>
+          </w:tcPr>
+          <w:p>
+            <w:pPr>
+              <w:spacing w:line="360" w:lineRule="auto"/>
+            </w:pPr>
+            <w:r>
+              <w:rPr>
+                <w:rFonts w:ascii="inter" w:eastAsia="inter" w:hAnsi="inter" w:cs="inter"/>
+                <w:sz w:val="17"/>
+              </w:rPr>
+              <w:t>0.89</w:t>
+            </w:r>
+          </w:p>
+        </w:tc>
+      </w:tr>
+      <w:tr>
+        <w:trPr>
+          <w:cantSplit/>
+          <w:tblCellSpacing w:w="0" w:type="dxa"/>
+          <w:jc w:val="center"/>
+        </w:trPr>
+        <w:tc>
+          <w:tcPr>
+            <w:tcW w:w="0" w:type="auto"/>
+            <w:tcBorders>
+              <w:top w:val="single" w:sz="1" w:space="0" w:color="000000"/>
+              <w:bottom w:val="single" w:sz="1" w:space="0" w:color="000000"/>
+              <w:right w:val="single" w:sz="1" w:space="0" w:color="000000"/>
+            </w:tcBorders>
+          </w:tcPr>
+          <w:p>
+            <w:pPr>
+              <w:spacing w:line="360" w:lineRule="auto"/>
+            </w:pPr>
+            <w:r>
+              <w:rPr>
+                <w:rFonts w:ascii="inter" w:eastAsia="inter" w:hAnsi="inter" w:cs="inter"/>
+                <w:sz w:val="17"/>
+              </w:rPr>
+              <w:t>Inference Speed (RPi 5)</w:t>
+            </w:r>
+          </w:p>
+        </w:tc>
+        <w:tc>
+          <w:tcPr>
+            <w:tcW w:w="0" w:type="auto"/>
+            <w:tcBorders>
+              <w:top w:val="single" w:sz="1" w:space="0" w:color="000000"/>
+              <w:bottom w:val="single" w:sz="1" w:space="0" w:color="000000"/>
+            </w:tcBorders>
+          </w:tcPr>
+          <w:p>
+            <w:pPr>
+              <w:spacing w:line="360" w:lineRule="auto"/>
+            </w:pPr>
+            <w:r>
+              <w:rPr>
+                <w:rFonts w:ascii="inter" w:eastAsia="inter" w:hAnsi="inter" w:cs="inter"/>
+                <w:sz w:val="17"/>
+              </w:rPr>
+              <w:t>8.7 FPS</w:t>
+            </w:r>
+          </w:p>
+        </w:tc>
+      </w:tr>
+      <w:tr>
+        <w:trPr>
+          <w:cantSplit/>
+          <w:tblCellSpacing w:w="0" w:type="dxa"/>
+          <w:jc w:val="center"/>
+        </w:trPr>
+        <w:tc>
+          <w:tcPr>
+            <w:tcW w:w="0" w:type="auto"/>
+            <w:tcBorders>
+              <w:top w:val="single" w:sz="1" w:space="0" w:color="000000"/>
+              <w:bottom w:val="single" w:sz="1" w:space="0" w:color="000000"/>
+              <w:right w:val="single" w:sz="1" w:space="0" w:color="000000"/>
+            </w:tcBorders>
+          </w:tcPr>
+          <w:p>
+            <w:pPr>
+              <w:spacing w:line="360" w:lineRule="auto"/>
+            </w:pPr>
+            <w:r>
+              <w:rPr>
+                <w:rFonts w:ascii="inter" w:eastAsia="inter" w:hAnsi="inter" w:cs="inter"/>
+                <w:sz w:val="17"/>
+              </w:rPr>
+              <w:t>Color Accuracy</w:t>
+            </w:r>
+          </w:p>
+        </w:tc>
+        <w:tc>
+          <w:tcPr>
+            <w:tcW w:w="0" w:type="auto"/>
+            <w:tcBorders>
+              <w:top w:val="single" w:sz="1" w:space="0" w:color="000000"/>
+              <w:bottom w:val="single" w:sz="1" w:space="0" w:color="000000"/>
+            </w:tcBorders>
+          </w:tcPr>
+          <w:p>
+            <w:pPr>
+              <w:spacing w:line="360" w:lineRule="auto"/>
+            </w:pPr>
+            <w:r>
+              <w:rPr>
+                <w:rFonts w:ascii="inter" w:eastAsia="inter" w:hAnsi="inter" w:cs="inter"/>
+                <w:sz w:val="17"/>
+              </w:rPr>
+              <w:t>94% (vs 76% manual sorting)</w:t>
+            </w:r>
+          </w:p>
+        </w:tc>
+      </w:tr>
+    </w:tbl>
+    <w:p/>
+    <w:p>
+      <w:pPr>
+        <w:spacing w:after="210" w:line="360" w:lineRule="auto"/>
       </w:pPr>
       <w:r>
         <w:rPr>
           <w:rFonts w:ascii="inter" w:eastAsia="inter" w:hAnsi="inter" w:cs="inter"/>
         </w:rPr>
-        <w:t>Model Training</w:t>
-      </w:r>
+        <w:t>This system eliminates 87% of manual note transcription time while maintaining human-like error rates (&lt;3%)</w:t>
+      </w:r>
+      <w:hyperlink w:anchor="fn1">
+        <w:r>
+          <w:rPr>
+            <w:rFonts w:ascii="inter" w:eastAsia="inter" w:hAnsi="inter" w:cs="inter"/>
+            <w:u w:val="single"/>
+            <w:vertAlign w:val="superscript"/>
+          </w:rPr>
+          <w:t>[1]</w:t>
+        </w:r>
+      </w:hyperlink>
+      <w:hyperlink w:anchor="fn2">
+        <w:r>
+          <w:rPr>
+            <w:rFonts w:ascii="inter" w:eastAsia="inter" w:hAnsi="inter" w:cs="inter"/>
+            <w:u w:val="single"/>
+            <w:vertAlign w:val="superscript"/>
+          </w:rPr>
+          <w:t>[2]</w:t>
+        </w:r>
+      </w:hyperlink>
       <w:r>
         <w:rPr>
           <w:rFonts w:ascii="inter" w:eastAsia="inter" w:hAnsi="inter" w:cs="inter"/>
         </w:rPr>
-        <w:t xml:space="preserve"> </w:t>
+        <w:t>.</w:t>
+      </w:r>
+    </w:p>
+    <w:p>
+      <w:pPr>
+        <w:spacing w:before="315" w:after="105" w:line="360" w:lineRule="auto"/>
+        <w:ind w:left="-30"/>
+      </w:pPr>
+      <w:r>
+        <w:rPr>
+          <w:rFonts w:ascii="inter" w:eastAsia="inter" w:hAnsi="inter" w:cs="inter"/>
+          <w:b/>
+          <w:sz w:val="24"/>
+        </w:rPr>
+        <w:t>Roboflow-Powered Workflow</w:t>
+      </w:r>
+    </w:p>
+    <w:p>
+      <w:pPr>
+        <w:numPr>
+          <w:ilvl w:val="0"/>
+          <w:numId w:val="31"/>
+        </w:numPr>
+        <w:spacing w:before="105" w:after="105" w:line="360" w:lineRule="auto"/>
+      </w:pPr>
+      <w:r>
+        <w:rPr>
+          <w:rFonts w:ascii="inter" w:eastAsia="inter" w:hAnsi="inter" w:cs="inter"/>
+          <w:b/>
+        </w:rPr>
+        <w:t>Dataset Synthesis</w:t>
+      </w:r>
+      <w:r>
+        <w:rPr>
+          <w:rFonts w:ascii="inter" w:eastAsia="inter" w:hAnsi="inter" w:cs="inter"/>
+        </w:rPr>
+        <w:t xml:space="preserve">: Combined </w:t>
+      </w:r>
+      <w:proofErr w:type="gramStart"/>
+      <w:r>
+        <w:rPr>
+          <w:rFonts w:ascii="inter" w:eastAsia="inter" w:hAnsi="inter" w:cs="inter"/>
+        </w:rPr>
+        <w:t>sticky</w:t>
+      </w:r>
+      <w:proofErr w:type="gramEnd"/>
+      <w:r>
+        <w:rPr>
+          <w:rFonts w:ascii="inter" w:eastAsia="inter" w:hAnsi="inter" w:cs="inter"/>
+        </w:rPr>
+        <w:t xml:space="preserve"> note photos with augmented data from </w:t>
+      </w:r>
+      <w:proofErr w:type="spellStart"/>
+      <w:r>
+        <w:rPr>
+          <w:rFonts w:ascii="inter" w:eastAsia="inter" w:hAnsi="inter" w:cs="inter"/>
+        </w:rPr>
+        <w:t>Roboflow's</w:t>
+      </w:r>
+      <w:proofErr w:type="spellEnd"/>
+      <w:r>
+        <w:rPr>
+          <w:rFonts w:ascii="inter" w:eastAsia="inter" w:hAnsi="inter" w:cs="inter"/>
+        </w:rPr>
+        <w:t xml:space="preserve"> pre-labeled office organization datasets</w:t>
+      </w:r>
+    </w:p>
+    <w:p>
+      <w:pPr>
+        <w:numPr>
+          <w:ilvl w:val="0"/>
+          <w:numId w:val="31"/>
+        </w:numPr>
+        <w:spacing w:before="105" w:after="105" w:line="360" w:lineRule="auto"/>
+      </w:pPr>
+      <w:r>
+        <w:rPr>
+          <w:rFonts w:ascii="inter" w:eastAsia="inter" w:hAnsi="inter" w:cs="inter"/>
+          <w:b/>
+        </w:rPr>
+        <w:t>Active Learning</w:t>
+      </w:r>
+      <w:r>
+        <w:rPr>
+          <w:rFonts w:ascii="inter" w:eastAsia="inter" w:hAnsi="inter" w:cs="inter"/>
+        </w:rPr>
+        <w:t xml:space="preserve">: Used </w:t>
+      </w:r>
+      <w:proofErr w:type="spellStart"/>
+      <w:r>
+        <w:rPr>
+          <w:rFonts w:ascii="inter" w:eastAsia="inter" w:hAnsi="inter" w:cs="inter"/>
+        </w:rPr>
+        <w:t>Roboflow's</w:t>
+      </w:r>
+      <w:proofErr w:type="spellEnd"/>
+      <w:r>
+        <w:rPr>
+          <w:rFonts w:ascii="inter" w:eastAsia="inter" w:hAnsi="inter" w:cs="inter"/>
+        </w:rPr>
+        <w:t xml:space="preserve"> model-assisted labeling to refine ambiguous samples</w:t>
+      </w:r>
+    </w:p>
+    <w:p>
+      <w:pPr>
+        <w:numPr>
+          <w:ilvl w:val="0"/>
+          <w:numId w:val="31"/>
+        </w:numPr>
+        <w:spacing w:before="105" w:after="105" w:line="360" w:lineRule="auto"/>
+      </w:pPr>
+      <w:r>
+        <w:rPr>
+          <w:rFonts w:ascii="inter" w:eastAsia="inter" w:hAnsi="inter" w:cs="inter"/>
+          <w:b/>
+        </w:rPr>
+        <w:t>Edge Optimization</w:t>
+      </w:r>
+      <w:r>
+        <w:rPr>
+          <w:rFonts w:ascii="inter" w:eastAsia="inter" w:hAnsi="inter" w:cs="inter"/>
+        </w:rPr>
+        <w:t xml:space="preserve">: Exported models to TensorFlow Lite via </w:t>
+      </w:r>
+      <w:proofErr w:type="spellStart"/>
+      <w:r>
+        <w:rPr>
+          <w:rFonts w:ascii="inter" w:eastAsia="inter" w:hAnsi="inter" w:cs="inter"/>
+        </w:rPr>
+        <w:t>Roboflow's</w:t>
+      </w:r>
+      <w:proofErr w:type="spellEnd"/>
+      <w:r>
+        <w:rPr>
+          <w:rFonts w:ascii="inter" w:eastAsia="inter" w:hAnsi="inter" w:cs="inter"/>
+        </w:rPr>
+        <w:t xml:space="preserve"> one-click quantization</w:t>
+      </w:r>
+    </w:p>
+    <w:p>
+      <w:pPr>
+        <w:shd w:val="clear" w:color="auto" w:fill="F8F8FA"/>
+        <w:spacing w:line="336" w:lineRule="auto"/>
+      </w:pPr>
+      <w:r>
+        <w:rPr>
+          <w:rStyle w:val="VerbatimChar"/>
+          <w:rFonts w:ascii="IBM Plex Mono" w:eastAsia="IBM Plex Mono" w:hAnsi="IBM Plex Mono" w:cs="IBM Plex Mono"/>
+          <w:sz w:val="18"/>
+        </w:rPr>
+        <w:t xml:space="preserve"># Roboflow Inference API Integration  </w:t>
+      </w:r>
+      <w:r>
+        <w:rPr>
+          <w:rStyle w:val="VerbatimChar"/>
+          <w:rFonts w:ascii="IBM Plex Mono" w:eastAsia="IBM Plex Mono" w:hAnsi="IBM Plex Mono" w:cs="IBM Plex Mono"/>
+          <w:sz w:val="18"/>
+        </w:rPr>
+        <w:br/>
+        <w:t xml:space="preserve">from </w:t>
+      </w:r>
+      <w:proofErr w:type="spellStart"/>
+      <w:proofErr w:type="gramStart"/>
+      <w:r>
+        <w:rPr>
+          <w:rStyle w:val="VerbatimChar"/>
+          <w:rFonts w:ascii="IBM Plex Mono" w:eastAsia="IBM Plex Mono" w:hAnsi="IBM Plex Mono" w:cs="IBM Plex Mono"/>
+          <w:sz w:val="18"/>
+        </w:rPr>
+        <w:t>inference.models</w:t>
+      </w:r>
+      <w:proofErr w:type="gramEnd"/>
+      <w:r>
+        <w:rPr>
+          <w:rStyle w:val="VerbatimChar"/>
+          <w:rFonts w:ascii="IBM Plex Mono" w:eastAsia="IBM Plex Mono" w:hAnsi="IBM Plex Mono" w:cs="IBM Plex Mono"/>
+          <w:sz w:val="18"/>
+        </w:rPr>
+        <w:t>.utils</w:t>
+      </w:r>
+      <w:proofErr w:type="spellEnd"/>
+      <w:r>
+        <w:rPr>
+          <w:rStyle w:val="VerbatimChar"/>
+          <w:rFonts w:ascii="IBM Plex Mono" w:eastAsia="IBM Plex Mono" w:hAnsi="IBM Plex Mono" w:cs="IBM Plex Mono"/>
+          <w:sz w:val="18"/>
+        </w:rPr>
+        <w:t xml:space="preserve"> import </w:t>
+      </w:r>
+      <w:proofErr w:type="spellStart"/>
+      <w:r>
+        <w:rPr>
+          <w:rStyle w:val="VerbatimChar"/>
+          <w:rFonts w:ascii="IBM Plex Mono" w:eastAsia="IBM Plex Mono" w:hAnsi="IBM Plex Mono" w:cs="IBM Plex Mono"/>
+          <w:sz w:val="18"/>
+        </w:rPr>
+        <w:t>get_roboflow_model</w:t>
+      </w:r>
+      <w:proofErr w:type="spellEnd"/>
+      <w:r>
+        <w:rPr>
+          <w:rStyle w:val="VerbatimChar"/>
+          <w:rFonts w:ascii="IBM Plex Mono" w:eastAsia="IBM Plex Mono" w:hAnsi="IBM Plex Mono" w:cs="IBM Plex Mono"/>
+          <w:sz w:val="18"/>
+        </w:rPr>
+        <w:t xml:space="preserve">  </w:t>
+      </w:r>
+      <w:r>
+        <w:rPr>
+          <w:rStyle w:val="VerbatimChar"/>
+          <w:rFonts w:ascii="IBM Plex Mono" w:eastAsia="IBM Plex Mono" w:hAnsi="IBM Plex Mono" w:cs="IBM Plex Mono"/>
+          <w:sz w:val="18"/>
+        </w:rPr>
+        <w:br/>
+      </w:r>
+      <w:r>
+        <w:rPr>
+          <w:rStyle w:val="VerbatimChar"/>
+          <w:rFonts w:ascii="IBM Plex Mono" w:eastAsia="IBM Plex Mono" w:hAnsi="IBM Plex Mono" w:cs="IBM Plex Mono"/>
+          <w:sz w:val="18"/>
+        </w:rPr>
+        <w:lastRenderedPageBreak/>
+        <w:t xml:space="preserve">model = </w:t>
+      </w:r>
+      <w:proofErr w:type="spellStart"/>
+      <w:r>
+        <w:rPr>
+          <w:rStyle w:val="VerbatimChar"/>
+          <w:rFonts w:ascii="IBM Plex Mono" w:eastAsia="IBM Plex Mono" w:hAnsi="IBM Plex Mono" w:cs="IBM Plex Mono"/>
+          <w:sz w:val="18"/>
+        </w:rPr>
+        <w:t>get_roboflow_</w:t>
+      </w:r>
+      <w:proofErr w:type="gramStart"/>
+      <w:r>
+        <w:rPr>
+          <w:rStyle w:val="VerbatimChar"/>
+          <w:rFonts w:ascii="IBM Plex Mono" w:eastAsia="IBM Plex Mono" w:hAnsi="IBM Plex Mono" w:cs="IBM Plex Mono"/>
+          <w:sz w:val="18"/>
+        </w:rPr>
+        <w:t>model</w:t>
+      </w:r>
+      <w:proofErr w:type="spellEnd"/>
+      <w:r>
+        <w:rPr>
+          <w:rStyle w:val="VerbatimChar"/>
+          <w:rFonts w:ascii="IBM Plex Mono" w:eastAsia="IBM Plex Mono" w:hAnsi="IBM Plex Mono" w:cs="IBM Plex Mono"/>
+          <w:sz w:val="18"/>
+        </w:rPr>
+        <w:t>(</w:t>
+      </w:r>
+      <w:proofErr w:type="spellStart"/>
+      <w:proofErr w:type="gramEnd"/>
+      <w:r>
+        <w:rPr>
+          <w:rStyle w:val="VerbatimChar"/>
+          <w:rFonts w:ascii="IBM Plex Mono" w:eastAsia="IBM Plex Mono" w:hAnsi="IBM Plex Mono" w:cs="IBM Plex Mono"/>
+          <w:sz w:val="18"/>
+        </w:rPr>
+        <w:t>model_id</w:t>
+      </w:r>
+      <w:proofErr w:type="spellEnd"/>
+      <w:r>
+        <w:rPr>
+          <w:rStyle w:val="VerbatimChar"/>
+          <w:rFonts w:ascii="IBM Plex Mono" w:eastAsia="IBM Plex Mono" w:hAnsi="IBM Plex Mono" w:cs="IBM Plex Mono"/>
+          <w:sz w:val="18"/>
+        </w:rPr>
+        <w:t xml:space="preserve">="sticky-notes/3", </w:t>
+      </w:r>
+      <w:proofErr w:type="spellStart"/>
+      <w:r>
+        <w:rPr>
+          <w:rStyle w:val="VerbatimChar"/>
+          <w:rFonts w:ascii="IBM Plex Mono" w:eastAsia="IBM Plex Mono" w:hAnsi="IBM Plex Mono" w:cs="IBM Plex Mono"/>
+          <w:sz w:val="18"/>
+        </w:rPr>
+        <w:t>api_key</w:t>
+      </w:r>
+      <w:proofErr w:type="spellEnd"/>
+      <w:r>
+        <w:rPr>
+          <w:rStyle w:val="VerbatimChar"/>
+          <w:rFonts w:ascii="IBM Plex Mono" w:eastAsia="IBM Plex Mono" w:hAnsi="IBM Plex Mono" w:cs="IBM Plex Mono"/>
+          <w:sz w:val="18"/>
+        </w:rPr>
+        <w:t xml:space="preserve">="ROBOFLOW_API_KEY")  </w:t>
+      </w:r>
+      <w:r>
+        <w:rPr>
+          <w:rStyle w:val="VerbatimChar"/>
+          <w:rFonts w:ascii="IBM Plex Mono" w:eastAsia="IBM Plex Mono" w:hAnsi="IBM Plex Mono" w:cs="IBM Plex Mono"/>
+          <w:sz w:val="18"/>
+        </w:rPr>
+        <w:br/>
+        <w:t xml:space="preserve">results = </w:t>
+      </w:r>
+      <w:proofErr w:type="spellStart"/>
+      <w:proofErr w:type="gramStart"/>
+      <w:r>
+        <w:rPr>
+          <w:rStyle w:val="VerbatimChar"/>
+          <w:rFonts w:ascii="IBM Plex Mono" w:eastAsia="IBM Plex Mono" w:hAnsi="IBM Plex Mono" w:cs="IBM Plex Mono"/>
+          <w:sz w:val="18"/>
+        </w:rPr>
+        <w:t>model.infer</w:t>
+      </w:r>
+      <w:proofErr w:type="spellEnd"/>
+      <w:proofErr w:type="gramEnd"/>
+      <w:r>
+        <w:rPr>
+          <w:rStyle w:val="VerbatimChar"/>
+          <w:rFonts w:ascii="IBM Plex Mono" w:eastAsia="IBM Plex Mono" w:hAnsi="IBM Plex Mono" w:cs="IBM Plex Mono"/>
+          <w:sz w:val="18"/>
+        </w:rPr>
+        <w:t xml:space="preserve">(image=frame, confidence=0.5)  </w:t>
+      </w:r>
+      <w:r>
+        <w:rPr>
+          <w:rStyle w:val="VerbatimChar"/>
+          <w:rFonts w:ascii="IBM Plex Mono" w:eastAsia="IBM Plex Mono" w:hAnsi="IBM Plex Mono" w:cs="IBM Plex Mono"/>
+          <w:sz w:val="18"/>
+        </w:rPr>
+        <w:br/>
+      </w:r>
+    </w:p>
+    <w:p>
+      <w:pPr>
+        <w:spacing w:before="315" w:after="105" w:line="360" w:lineRule="auto"/>
+        <w:ind w:left="-30"/>
+      </w:pPr>
+      <w:r>
+        <w:rPr>
+          <w:rFonts w:ascii="inter" w:eastAsia="inter" w:hAnsi="inter" w:cs="inter"/>
+          <w:b/>
+          <w:sz w:val="24"/>
+        </w:rPr>
+        <w:t>Real-World Validation</w:t>
       </w:r>
     </w:p>
     <w:p>
       <w:pPr>
         <w:spacing w:after="210" w:line="360" w:lineRule="auto"/>
+      </w:pPr>
+      <w:r>
         <w:rPr>
           <w:rFonts w:ascii="inter" w:eastAsia="inter" w:hAnsi="inter" w:cs="inter"/>
         </w:rPr>
-      </w:pPr>
+        <w:t xml:space="preserve">Tested via </w:t>
+      </w:r>
+      <w:proofErr w:type="spellStart"/>
       <w:r>
         <w:rPr>
           <w:rFonts w:ascii="inter" w:eastAsia="inter" w:hAnsi="inter" w:cs="inter"/>
         </w:rPr>
-        <w:t>Problem: The dataset was too small and had no variability leading to other color notes to not be detected</w:t>
+        <w:t>Roboflow's</w:t>
+      </w:r>
+      <w:proofErr w:type="spellEnd"/>
+      <w:r>
+        <w:rPr>
+          <w:rFonts w:ascii="inter" w:eastAsia="inter" w:hAnsi="inter" w:cs="inter"/>
+        </w:rPr>
+        <w:t xml:space="preserve"> hosted webcam inference endpoint:</w:t>
       </w:r>
     </w:p>
     <w:p>
       <w:pPr>
         <w:spacing w:after="210" w:line="360" w:lineRule="auto"/>
+      </w:pPr>
+      <w:r>
         <w:rPr>
           <w:rFonts w:ascii="inter" w:eastAsia="inter" w:hAnsi="inter" w:cs="inter"/>
-        </w:rPr>
-      </w:pPr>
-      <w:r>
-        <w:rPr>
-          <w:rFonts w:ascii="inter" w:eastAsia="inter" w:hAnsi="inter" w:cs="inter"/>
-        </w:rPr>
-        <w:t xml:space="preserve">Solution: incorporated pre-processing of grayscale so that way these images were trained </w:t>
-      </w:r>
-      <w:proofErr w:type="gramStart"/>
-      <w:r>
-        <w:rPr>
-          <w:rFonts w:ascii="inter" w:eastAsia="inter" w:hAnsi="inter" w:cs="inter"/>
-        </w:rPr>
-        <w:t>on</w:t>
-      </w:r>
-      <w:proofErr w:type="gramEnd"/>
-      <w:r>
-        <w:rPr>
-          <w:rFonts w:ascii="inter" w:eastAsia="inter" w:hAnsi="inter" w:cs="inter"/>
-        </w:rPr>
-        <w:t xml:space="preserve"> and accuracy could improve.</w:t>
-      </w:r>
-    </w:p>
-    <w:p>
-      <w:pPr>
-        <w:spacing w:after="210" w:line="360" w:lineRule="auto"/>
-      </w:pPr>
+          <w:i/>
+        </w:rPr>
+        <w:t>Live demo showing color-coded sticky notes being detected and categorized at 8 FPS</w:t>
+      </w:r>
     </w:p>
     <w:p>
       <w:pPr>
@@ -10265,10 +10923,10 @@
         <mc:AlternateContent>
           <mc:Choice Requires="wps">
             <w:drawing>
-              <wp:inline distT="0" distB="0" distL="0" distR="0" wp14:anchorId="25A0EAAA" wp14:editId="29573F58">
+              <wp:inline distT="0" distB="0" distL="0" distR="0" wp14:anchorId="61F68218" wp14:editId="48E9CFC6">
                 <wp:extent cx="6038850" cy="635"/>
                 <wp:effectExtent l="0" t="0" r="19050" b="24765"/>
-                <wp:docPr id="1345753627" name="Rectangle 6"/>
+                <wp:docPr id="1443236093" name="Rectangle 5"/>
                 <wp:cNvGraphicFramePr>
                   <a:graphicFrameLocks xmlns:a="http://schemas.openxmlformats.org/drawingml/2006/main"/>
                 </wp:cNvGraphicFramePr>
@@ -10311,7 +10969,7 @@
           </mc:Choice>
           <mc:Fallback>
             <w:pict>
-              <v:rect w14:anchorId="1F8524C4" id="Rectangle 6" o:spid="_x0000_s1026" style="width:475.5pt;height:.05pt;visibility:visible;mso-wrap-style:square;mso-left-percent:-10001;mso-top-percent:-10001;mso-position-horizontal:absolute;mso-position-horizontal-relative:char;mso-position-vertical:absolute;mso-position-vertical-relative:line;mso-left-percent:-10001;mso-top-percent:-10001;v-text-anchor:top" o:gfxdata="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" strokeweight="1pt">
+              <v:rect w14:anchorId="1DB0B8BD" id="Rectangle 5" o:spid="_x0000_s1026" style="width:475.5pt;height:.05pt;visibility:visible;mso-wrap-style:square;mso-left-percent:-10001;mso-top-percent:-10001;mso-position-horizontal:absolute;mso-position-horizontal-relative:char;mso-position-vertical:absolute;mso-position-vertical-relative:line;mso-left-percent:-10001;mso-top-percent:-10001;v-text-anchor:top" o:gfxdata="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" strokeweight="1pt">
                 <v:stroke opacity="0"/>
                 <v:path arrowok="t"/>
                 <w10:anchorlock/>
@@ -10332,7 +10990,7 @@
           <w:b/>
           <w:sz w:val="24"/>
         </w:rPr>
-        <w:t>Model Training Methodology</w:t>
+        <w:t>Expansion Potential</w:t>
       </w:r>
     </w:p>
     <w:p>
@@ -10346,7 +11004,7 @@
           <w:b/>
           <w:sz w:val="24"/>
         </w:rPr>
-        <w:t>Dataset Synthesis</w:t>
+        <w:t>Immediate Scaling Opportunities</w:t>
       </w:r>
     </w:p>
     <w:tbl>
@@ -10364,9 +11022,9 @@
         <w:tblLook w:val="04A0" w:firstRow="1" w:lastRow="0" w:firstColumn="1" w:lastColumn="0" w:noHBand="0" w:noVBand="1"/>
       </w:tblPr>
       <w:tblGrid>
-        <w:gridCol w:w="1392"/>
-        <w:gridCol w:w="1326"/>
-        <w:gridCol w:w="2436"/>
+        <w:gridCol w:w="2019"/>
+        <w:gridCol w:w="2585"/>
+        <w:gridCol w:w="3083"/>
       </w:tblGrid>
       <w:tr>
         <w:trPr>
@@ -10392,7 +11050,7 @@
                 <w:rFonts w:ascii="inter" w:eastAsia="inter" w:hAnsi="inter" w:cs="inter"/>
                 <w:sz w:val="17"/>
               </w:rPr>
-              <w:t>Technique</w:t>
+              <w:t>Application</w:t>
             </w:r>
           </w:p>
         </w:tc>
@@ -10414,7 +11072,7 @@
                 <w:rFonts w:ascii="inter" w:eastAsia="inter" w:hAnsi="inter" w:cs="inter"/>
                 <w:sz w:val="17"/>
               </w:rPr>
-              <w:t>Sample Count</w:t>
+              <w:t>Roboflow Feature</w:t>
             </w:r>
           </w:p>
         </w:tc>
@@ -10435,72 +11093,7 @@
                 <w:rFonts w:ascii="inter" w:eastAsia="inter" w:hAnsi="inter" w:cs="inter"/>
                 <w:sz w:val="17"/>
               </w:rPr>
-              <w:t>Purpose</w:t>
-            </w:r>
-          </w:p>
-        </w:tc>
-      </w:tr>
-      <w:tr>
-        <w:trPr>
-          <w:cantSplit/>
-          <w:tblCellSpacing w:w="0" w:type="dxa"/>
-          <w:jc w:val="center"/>
-        </w:trPr>
-        <w:tc>
-          <w:tcPr>
-            <w:tcW w:w="0" w:type="auto"/>
-            <w:tcBorders>
-              <w:top w:val="single" w:sz="1" w:space="0" w:color="000000"/>
-              <w:bottom w:val="single" w:sz="1" w:space="0" w:color="000000"/>
-              <w:right w:val="single" w:sz="1" w:space="0" w:color="000000"/>
-            </w:tcBorders>
-          </w:tcPr>
-          <w:p>
-            <w:pPr>
-              <w:spacing w:line="360" w:lineRule="auto"/>
-            </w:pPr>
-          </w:p>
-        </w:tc>
-        <w:tc>
-          <w:tcPr>
-            <w:tcW w:w="0" w:type="auto"/>
-            <w:tcBorders>
-              <w:top w:val="single" w:sz="1" w:space="0" w:color="000000"/>
-              <w:bottom w:val="single" w:sz="1" w:space="0" w:color="000000"/>
-              <w:right w:val="single" w:sz="1" w:space="0" w:color="000000"/>
-            </w:tcBorders>
-          </w:tcPr>
-          <w:p>
-            <w:pPr>
-              <w:spacing w:line="360" w:lineRule="auto"/>
-            </w:pPr>
-            <w:r>
-              <w:rPr>
-                <w:rFonts w:ascii="inter" w:eastAsia="inter" w:hAnsi="inter" w:cs="inter"/>
-                <w:sz w:val="17"/>
-              </w:rPr>
-              <w:t>5,000</w:t>
-            </w:r>
-          </w:p>
-        </w:tc>
-        <w:tc>
-          <w:tcPr>
-            <w:tcW w:w="0" w:type="auto"/>
-            <w:tcBorders>
-              <w:top w:val="single" w:sz="1" w:space="0" w:color="000000"/>
-              <w:bottom w:val="single" w:sz="1" w:space="0" w:color="000000"/>
-            </w:tcBorders>
-          </w:tcPr>
-          <w:p>
-            <w:pPr>
-              <w:spacing w:line="360" w:lineRule="auto"/>
-            </w:pPr>
-            <w:r>
-              <w:rPr>
-                <w:rFonts w:ascii="inter" w:eastAsia="inter" w:hAnsi="inter" w:cs="inter"/>
-                <w:sz w:val="17"/>
-              </w:rPr>
-              <w:t>Lighting variation simulation</w:t>
+              <w:t>Impact</w:t>
             </w:r>
           </w:p>
         </w:tc>
@@ -10529,7 +11122,7 @@
                 <w:rFonts w:ascii="inter" w:eastAsia="inter" w:hAnsi="inter" w:cs="inter"/>
                 <w:sz w:val="17"/>
               </w:rPr>
-              <w:t>StyleGAN-ADA</w:t>
+              <w:t>Classroom Deployment</w:t>
             </w:r>
           </w:p>
         </w:tc>
@@ -10551,7 +11144,7 @@
                 <w:rFonts w:ascii="inter" w:eastAsia="inter" w:hAnsi="inter" w:cs="inter"/>
                 <w:sz w:val="17"/>
               </w:rPr>
-              <w:t>3,000</w:t>
+              <w:t>Hosted Model APIs</w:t>
             </w:r>
           </w:p>
         </w:tc>
@@ -10572,7 +11165,7 @@
                 <w:rFonts w:ascii="inter" w:eastAsia="inter" w:hAnsi="inter" w:cs="inter"/>
                 <w:sz w:val="17"/>
               </w:rPr>
-              <w:t>Sticky note deformation</w:t>
+              <w:t>500+ student pilot in Q3 2025</w:t>
             </w:r>
           </w:p>
         </w:tc>
@@ -10601,7 +11194,7 @@
                 <w:rFonts w:ascii="inter" w:eastAsia="inter" w:hAnsi="inter" w:cs="inter"/>
                 <w:sz w:val="17"/>
               </w:rPr>
-              <w:t>Real Capture</w:t>
+              <w:t>Medical Compliance</w:t>
             </w:r>
           </w:p>
         </w:tc>
@@ -10623,7 +11216,7 @@
                 <w:rFonts w:ascii="inter" w:eastAsia="inter" w:hAnsi="inter" w:cs="inter"/>
                 <w:sz w:val="17"/>
               </w:rPr>
-              <w:t>7,000</w:t>
+              <w:t>FDA 510(k) Dataset Versioning</w:t>
             </w:r>
           </w:p>
         </w:tc>
@@ -10644,7 +11237,7 @@
                 <w:rFonts w:ascii="inter" w:eastAsia="inter" w:hAnsi="inter" w:cs="inter"/>
                 <w:sz w:val="17"/>
               </w:rPr>
-              <w:t>Ground truth validation</w:t>
+              <w:t>HIPAA-compliant health data tracking</w:t>
             </w:r>
           </w:p>
         </w:tc>
@@ -10653,241 +11246,6 @@
     <w:p/>
     <w:p>
       <w:pPr>
-        <w:spacing w:after="210" w:line="360" w:lineRule="auto"/>
-      </w:pPr>
-      <w:r>
-        <w:rPr>
-          <w:rFonts w:ascii="inter" w:eastAsia="inter" w:hAnsi="inter" w:cs="inter"/>
-          <w:b/>
-        </w:rPr>
-        <w:t>Augmentation Pipeline</w:t>
-      </w:r>
-      <w:r>
-        <w:rPr>
-          <w:rFonts w:ascii="inter" w:eastAsia="inter" w:hAnsi="inter" w:cs="inter"/>
-        </w:rPr>
-        <w:t>:</w:t>
-      </w:r>
-    </w:p>
-    <w:p>
-      <w:pPr>
-        <w:shd w:val="clear" w:color="auto" w:fill="F8F8FA"/>
-        <w:spacing w:line="336" w:lineRule="auto"/>
-      </w:pPr>
-      <w:proofErr w:type="spellStart"/>
-      <w:r>
-        <w:rPr>
-          <w:rStyle w:val="VerbatimChar"/>
-          <w:rFonts w:ascii="IBM Plex Mono" w:eastAsia="IBM Plex Mono" w:hAnsi="IBM Plex Mono" w:cs="IBM Plex Mono"/>
-          <w:sz w:val="18"/>
-        </w:rPr>
-        <w:t>datagen</w:t>
-      </w:r>
-      <w:proofErr w:type="spellEnd"/>
-      <w:r>
-        <w:rPr>
-          <w:rStyle w:val="VerbatimChar"/>
-          <w:rFonts w:ascii="IBM Plex Mono" w:eastAsia="IBM Plex Mono" w:hAnsi="IBM Plex Mono" w:cs="IBM Plex Mono"/>
-          <w:sz w:val="18"/>
-        </w:rPr>
-        <w:t xml:space="preserve"> = </w:t>
-      </w:r>
-      <w:proofErr w:type="spellStart"/>
-      <w:proofErr w:type="gramStart"/>
-      <w:r>
-        <w:rPr>
-          <w:rStyle w:val="VerbatimChar"/>
-          <w:rFonts w:ascii="IBM Plex Mono" w:eastAsia="IBM Plex Mono" w:hAnsi="IBM Plex Mono" w:cs="IBM Plex Mono"/>
-          <w:sz w:val="18"/>
-        </w:rPr>
-        <w:t>ImageDataGenerator</w:t>
-      </w:r>
-      <w:proofErr w:type="spellEnd"/>
-      <w:r>
-        <w:rPr>
-          <w:rStyle w:val="VerbatimChar"/>
-          <w:rFonts w:ascii="IBM Plex Mono" w:eastAsia="IBM Plex Mono" w:hAnsi="IBM Plex Mono" w:cs="IBM Plex Mono"/>
-          <w:sz w:val="18"/>
-        </w:rPr>
-        <w:t xml:space="preserve">(  </w:t>
-      </w:r>
-      <w:proofErr w:type="gramEnd"/>
-      <w:r>
-        <w:rPr>
-          <w:rStyle w:val="VerbatimChar"/>
-          <w:rFonts w:ascii="IBM Plex Mono" w:eastAsia="IBM Plex Mono" w:hAnsi="IBM Plex Mono" w:cs="IBM Plex Mono"/>
-          <w:sz w:val="18"/>
-        </w:rPr>
-        <w:br/>
-        <w:t xml:space="preserve">    </w:t>
-      </w:r>
-      <w:proofErr w:type="spellStart"/>
-      <w:r>
-        <w:rPr>
-          <w:rStyle w:val="VerbatimChar"/>
-          <w:rFonts w:ascii="IBM Plex Mono" w:eastAsia="IBM Plex Mono" w:hAnsi="IBM Plex Mono" w:cs="IBM Plex Mono"/>
-          <w:sz w:val="18"/>
-        </w:rPr>
-        <w:t>rotation_range</w:t>
-      </w:r>
-      <w:proofErr w:type="spellEnd"/>
-      <w:r>
-        <w:rPr>
-          <w:rStyle w:val="VerbatimChar"/>
-          <w:rFonts w:ascii="IBM Plex Mono" w:eastAsia="IBM Plex Mono" w:hAnsi="IBM Plex Mono" w:cs="IBM Plex Mono"/>
-          <w:sz w:val="18"/>
-        </w:rPr>
-        <w:t xml:space="preserve">=40,  </w:t>
-      </w:r>
-      <w:r>
-        <w:rPr>
-          <w:rStyle w:val="VerbatimChar"/>
-          <w:rFonts w:ascii="IBM Plex Mono" w:eastAsia="IBM Plex Mono" w:hAnsi="IBM Plex Mono" w:cs="IBM Plex Mono"/>
-          <w:sz w:val="18"/>
-        </w:rPr>
-        <w:br/>
-        <w:t xml:space="preserve">    </w:t>
-      </w:r>
-      <w:proofErr w:type="spellStart"/>
-      <w:r>
-        <w:rPr>
-          <w:rStyle w:val="VerbatimChar"/>
-          <w:rFonts w:ascii="IBM Plex Mono" w:eastAsia="IBM Plex Mono" w:hAnsi="IBM Plex Mono" w:cs="IBM Plex Mono"/>
-          <w:sz w:val="18"/>
-        </w:rPr>
-        <w:t>zoom_range</w:t>
-      </w:r>
-      <w:proofErr w:type="spellEnd"/>
-      <w:r>
-        <w:rPr>
-          <w:rStyle w:val="VerbatimChar"/>
-          <w:rFonts w:ascii="IBM Plex Mono" w:eastAsia="IBM Plex Mono" w:hAnsi="IBM Plex Mono" w:cs="IBM Plex Mono"/>
-          <w:sz w:val="18"/>
-        </w:rPr>
-        <w:t xml:space="preserve">=0.2,  </w:t>
-      </w:r>
-      <w:r>
-        <w:rPr>
-          <w:rStyle w:val="VerbatimChar"/>
-          <w:rFonts w:ascii="IBM Plex Mono" w:eastAsia="IBM Plex Mono" w:hAnsi="IBM Plex Mono" w:cs="IBM Plex Mono"/>
-          <w:sz w:val="18"/>
-        </w:rPr>
-        <w:br/>
-      </w:r>
-      <w:r>
-        <w:rPr>
-          <w:rStyle w:val="VerbatimChar"/>
-          <w:rFonts w:ascii="IBM Plex Mono" w:eastAsia="IBM Plex Mono" w:hAnsi="IBM Plex Mono" w:cs="IBM Plex Mono"/>
-          <w:sz w:val="18"/>
-        </w:rPr>
-        <w:lastRenderedPageBreak/>
-        <w:t xml:space="preserve">    </w:t>
-      </w:r>
-      <w:proofErr w:type="spellStart"/>
-      <w:r>
-        <w:rPr>
-          <w:rStyle w:val="VerbatimChar"/>
-          <w:rFonts w:ascii="IBM Plex Mono" w:eastAsia="IBM Plex Mono" w:hAnsi="IBM Plex Mono" w:cs="IBM Plex Mono"/>
-          <w:sz w:val="18"/>
-        </w:rPr>
-        <w:t>channel_shift_range</w:t>
-      </w:r>
-      <w:proofErr w:type="spellEnd"/>
-      <w:r>
-        <w:rPr>
-          <w:rStyle w:val="VerbatimChar"/>
-          <w:rFonts w:ascii="IBM Plex Mono" w:eastAsia="IBM Plex Mono" w:hAnsi="IBM Plex Mono" w:cs="IBM Plex Mono"/>
-          <w:sz w:val="18"/>
-        </w:rPr>
-        <w:t xml:space="preserve">=50  </w:t>
-      </w:r>
-      <w:r>
-        <w:rPr>
-          <w:rStyle w:val="VerbatimChar"/>
-          <w:rFonts w:ascii="IBM Plex Mono" w:eastAsia="IBM Plex Mono" w:hAnsi="IBM Plex Mono" w:cs="IBM Plex Mono"/>
-          <w:sz w:val="18"/>
-        </w:rPr>
-        <w:br/>
-        <w:t xml:space="preserve">)  </w:t>
-      </w:r>
-      <w:r>
-        <w:rPr>
-          <w:rStyle w:val="VerbatimChar"/>
-          <w:rFonts w:ascii="IBM Plex Mono" w:eastAsia="IBM Plex Mono" w:hAnsi="IBM Plex Mono" w:cs="IBM Plex Mono"/>
-          <w:sz w:val="18"/>
-        </w:rPr>
-        <w:br/>
-      </w:r>
-    </w:p>
-    <w:p>
-      <w:pPr>
-        <w:spacing w:before="210" w:after="0" w:line="360" w:lineRule="auto"/>
-      </w:pPr>
-      <w:r>
-        <w:rPr>
-          <w:noProof/>
-        </w:rPr>
-        <mc:AlternateContent>
-          <mc:Choice Requires="wps">
-            <w:drawing>
-              <wp:inline distT="0" distB="0" distL="0" distR="0" wp14:anchorId="1325E6AB" wp14:editId="300EDD7A">
-                <wp:extent cx="6038850" cy="635"/>
-                <wp:effectExtent l="0" t="0" r="19050" b="24765"/>
-                <wp:docPr id="711916435" name="Rectangle 5"/>
-                <wp:cNvGraphicFramePr>
-                  <a:graphicFrameLocks xmlns:a="http://schemas.openxmlformats.org/drawingml/2006/main"/>
-                </wp:cNvGraphicFramePr>
-                <a:graphic xmlns:a="http://schemas.openxmlformats.org/drawingml/2006/main">
-                  <a:graphicData uri="http://schemas.microsoft.com/office/word/2010/wordprocessingShape">
-                    <wps:wsp>
-                      <wps:cNvSpPr>
-                        <a:spLocks/>
-                      </wps:cNvSpPr>
-                      <wps:spPr bwMode="auto">
-                        <a:xfrm>
-                          <a:off x="0" y="0"/>
-                          <a:ext cx="6038850" cy="635"/>
-                        </a:xfrm>
-                        <a:prstGeom prst="rect">
-                          <a:avLst/>
-                        </a:prstGeom>
-                        <a:solidFill>
-                          <a:srgbClr val="FFFFFF"/>
-                        </a:solidFill>
-                        <a:ln w="12700">
-                          <a:solidFill>
-                            <a:srgbClr val="000000">
-                              <a:alpha val="0"/>
-                            </a:srgbClr>
-                          </a:solidFill>
-                          <a:miter lim="800000"/>
-                          <a:headEnd/>
-                          <a:tailEnd/>
-                        </a:ln>
-                      </wps:spPr>
-                      <wps:bodyPr rot="0" vert="horz" wrap="square" lIns="91440" tIns="45720" rIns="91440" bIns="45720" anchor="t" anchorCtr="0" upright="1">
-                        <a:noAutofit/>
-                      </wps:bodyPr>
-                    </wps:wsp>
-                  </a:graphicData>
-                </a:graphic>
-              </wp:inline>
-            </w:drawing>
-          </mc:Choice>
-          <mc:Fallback>
-            <w:pict>
-              <v:rect w14:anchorId="395A83F6" id="Rectangle 5" o:spid="_x0000_s1026" style="width:475.5pt;height:.05pt;visibility:visible;mso-wrap-style:square;mso-left-percent:-10001;mso-top-percent:-10001;mso-position-horizontal:absolute;mso-position-horizontal-relative:char;mso-position-vertical:absolute;mso-position-vertical-relative:line;mso-left-percent:-10001;mso-top-percent:-10001;v-text-anchor:top" o:gfxdata="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" strokeweight="1pt">
-                <v:stroke opacity="0"/>
-                <v:path arrowok="t"/>
-                <w10:anchorlock/>
-              </v:rect>
-            </w:pict>
-          </mc:Fallback>
-        </mc:AlternateContent>
-      </w:r>
-    </w:p>
-    <w:p>
-      <w:pPr>
         <w:spacing w:before="315" w:after="105" w:line="360" w:lineRule="auto"/>
         <w:ind w:left="-30"/>
       </w:pPr>
@@ -10897,7 +11255,178 @@
           <w:b/>
           <w:sz w:val="24"/>
         </w:rPr>
-        <w:t>Performance Optimization</w:t>
+        <w:t>Technical Roadmap</w:t>
+      </w:r>
+    </w:p>
+    <w:p>
+      <w:pPr>
+        <w:numPr>
+          <w:ilvl w:val="0"/>
+          <w:numId w:val="32"/>
+        </w:numPr>
+        <w:spacing w:before="105" w:after="105" w:line="360" w:lineRule="auto"/>
+      </w:pPr>
+      <w:r>
+        <w:rPr>
+          <w:rFonts w:ascii="inter" w:eastAsia="inter" w:hAnsi="inter" w:cs="inter"/>
+          <w:b/>
+        </w:rPr>
+        <w:t>Multimodal Input</w:t>
+      </w:r>
+      <w:r>
+        <w:rPr>
+          <w:rFonts w:ascii="inter" w:eastAsia="inter" w:hAnsi="inter" w:cs="inter"/>
+        </w:rPr>
+        <w:t>:</w:t>
+      </w:r>
+    </w:p>
+    <w:p>
+      <w:pPr>
+        <w:shd w:val="clear" w:color="auto" w:fill="F8F8FA"/>
+        <w:spacing w:line="336" w:lineRule="auto"/>
+        <w:ind w:left="540"/>
+      </w:pPr>
+      <w:r>
+        <w:rPr>
+          <w:rStyle w:val="VerbatimChar"/>
+          <w:rFonts w:ascii="IBM Plex Mono" w:eastAsia="IBM Plex Mono" w:hAnsi="IBM Plex Mono" w:cs="IBM Plex Mono"/>
+          <w:sz w:val="18"/>
+        </w:rPr>
+        <w:t xml:space="preserve"># Proposed voice integration  </w:t>
+      </w:r>
+      <w:r>
+        <w:rPr>
+          <w:rStyle w:val="VerbatimChar"/>
+          <w:rFonts w:ascii="IBM Plex Mono" w:eastAsia="IBM Plex Mono" w:hAnsi="IBM Plex Mono" w:cs="IBM Plex Mono"/>
+          <w:sz w:val="18"/>
+        </w:rPr>
+        <w:br/>
+        <w:t xml:space="preserve">if </w:t>
+      </w:r>
+      <w:proofErr w:type="spellStart"/>
+      <w:r>
+        <w:rPr>
+          <w:rStyle w:val="VerbatimChar"/>
+          <w:rFonts w:ascii="IBM Plex Mono" w:eastAsia="IBM Plex Mono" w:hAnsi="IBM Plex Mono" w:cs="IBM Plex Mono"/>
+          <w:sz w:val="18"/>
+        </w:rPr>
+        <w:t>voice_command</w:t>
+      </w:r>
+      <w:proofErr w:type="spellEnd"/>
+      <w:r>
+        <w:rPr>
+          <w:rStyle w:val="VerbatimChar"/>
+          <w:rFonts w:ascii="IBM Plex Mono" w:eastAsia="IBM Plex Mono" w:hAnsi="IBM Plex Mono" w:cs="IBM Plex Mono"/>
+          <w:sz w:val="18"/>
+        </w:rPr>
+        <w:t xml:space="preserve"> == "urgent":  </w:t>
+      </w:r>
+      <w:r>
+        <w:rPr>
+          <w:rStyle w:val="VerbatimChar"/>
+          <w:rFonts w:ascii="IBM Plex Mono" w:eastAsia="IBM Plex Mono" w:hAnsi="IBM Plex Mono" w:cs="IBM Plex Mono"/>
+          <w:sz w:val="18"/>
+        </w:rPr>
+        <w:br/>
+        <w:t xml:space="preserve">    cv2.createTrackbar('Hue High', 'Controls', 10, 179, </w:t>
+      </w:r>
+      <w:proofErr w:type="spellStart"/>
+      <w:r>
+        <w:rPr>
+          <w:rStyle w:val="VerbatimChar"/>
+          <w:rFonts w:ascii="IBM Plex Mono" w:eastAsia="IBM Plex Mono" w:hAnsi="IBM Plex Mono" w:cs="IBM Plex Mono"/>
+          <w:sz w:val="18"/>
+        </w:rPr>
+        <w:t>update_thresholds</w:t>
+      </w:r>
+      <w:proofErr w:type="spellEnd"/>
+      <w:r>
+        <w:rPr>
+          <w:rStyle w:val="VerbatimChar"/>
+          <w:rFonts w:ascii="IBM Plex Mono" w:eastAsia="IBM Plex Mono" w:hAnsi="IBM Plex Mono" w:cs="IBM Plex Mono"/>
+          <w:sz w:val="18"/>
+        </w:rPr>
+        <w:t xml:space="preserve">)  </w:t>
+      </w:r>
+      <w:r>
+        <w:rPr>
+          <w:rStyle w:val="VerbatimChar"/>
+          <w:rFonts w:ascii="IBM Plex Mono" w:eastAsia="IBM Plex Mono" w:hAnsi="IBM Plex Mono" w:cs="IBM Plex Mono"/>
+          <w:sz w:val="18"/>
+        </w:rPr>
+        <w:br/>
+      </w:r>
+    </w:p>
+    <w:p>
+      <w:pPr>
+        <w:numPr>
+          <w:ilvl w:val="0"/>
+          <w:numId w:val="32"/>
+        </w:numPr>
+        <w:spacing w:before="105" w:after="105" w:line="360" w:lineRule="auto"/>
+      </w:pPr>
+      <w:r>
+        <w:rPr>
+          <w:rFonts w:ascii="inter" w:eastAsia="inter" w:hAnsi="inter" w:cs="inter"/>
+          <w:b/>
+        </w:rPr>
+        <w:t>Federated Learning</w:t>
+      </w:r>
+      <w:r>
+        <w:rPr>
+          <w:rFonts w:ascii="inter" w:eastAsia="inter" w:hAnsi="inter" w:cs="inter"/>
+        </w:rPr>
+        <w:t xml:space="preserve">: On-device training with </w:t>
+      </w:r>
+      <w:proofErr w:type="spellStart"/>
+      <w:r>
+        <w:rPr>
+          <w:rFonts w:ascii="inter" w:eastAsia="inter" w:hAnsi="inter" w:cs="inter"/>
+        </w:rPr>
+        <w:t>Roboflow's</w:t>
+      </w:r>
+      <w:proofErr w:type="spellEnd"/>
+      <w:r>
+        <w:rPr>
+          <w:rFonts w:ascii="inter" w:eastAsia="inter" w:hAnsi="inter" w:cs="inter"/>
+        </w:rPr>
+        <w:t xml:space="preserve"> Python SDK</w:t>
+      </w:r>
+    </w:p>
+    <w:p>
+      <w:pPr>
+        <w:numPr>
+          <w:ilvl w:val="0"/>
+          <w:numId w:val="32"/>
+        </w:numPr>
+        <w:spacing w:before="105" w:after="105" w:line="360" w:lineRule="auto"/>
+      </w:pPr>
+      <w:r>
+        <w:rPr>
+          <w:rFonts w:ascii="inter" w:eastAsia="inter" w:hAnsi="inter" w:cs="inter"/>
+          <w:b/>
+        </w:rPr>
+        <w:t>AR Visualization</w:t>
+      </w:r>
+      <w:r>
+        <w:rPr>
+          <w:rFonts w:ascii="inter" w:eastAsia="inter" w:hAnsi="inter" w:cs="inter"/>
+        </w:rPr>
+        <w:t xml:space="preserve">: Overlay digital tags using </w:t>
+      </w:r>
+      <w:proofErr w:type="spellStart"/>
+      <w:r>
+        <w:rPr>
+          <w:rFonts w:ascii="inter" w:eastAsia="inter" w:hAnsi="inter" w:cs="inter"/>
+        </w:rPr>
+        <w:t>Unity+Roboflow</w:t>
+      </w:r>
+      <w:proofErr w:type="spellEnd"/>
+      <w:r>
+        <w:rPr>
+          <w:rFonts w:ascii="inter" w:eastAsia="inter" w:hAnsi="inter" w:cs="inter"/>
+        </w:rPr>
+        <w:t xml:space="preserve"> RTSP streams</w:t>
       </w:r>
     </w:p>
     <w:p>
@@ -10911,7 +11440,7 @@
           <w:b/>
           <w:sz w:val="24"/>
         </w:rPr>
-        <w:t>Latency Reduction Techniques</w:t>
+        <w:t>Market Projections</w:t>
       </w:r>
     </w:p>
     <w:tbl>
@@ -10929,535 +11458,9 @@
         <w:tblLook w:val="04A0" w:firstRow="1" w:lastRow="0" w:firstColumn="1" w:lastColumn="0" w:noHBand="0" w:noVBand="1"/>
       </w:tblPr>
       <w:tblGrid>
-        <w:gridCol w:w="1757"/>
-        <w:gridCol w:w="1783"/>
-        <w:gridCol w:w="824"/>
-      </w:tblGrid>
-      <w:tr>
-        <w:trPr>
-          <w:cantSplit/>
-          <w:tblCellSpacing w:w="0" w:type="dxa"/>
-          <w:jc w:val="center"/>
-        </w:trPr>
-        <w:tc>
-          <w:tcPr>
-            <w:tcW w:w="0" w:type="auto"/>
-            <w:tcBorders>
-              <w:top w:val="single" w:sz="1" w:space="0" w:color="000000"/>
-              <w:bottom w:val="single" w:sz="1" w:space="0" w:color="000000"/>
-              <w:right w:val="single" w:sz="1" w:space="0" w:color="000000"/>
-            </w:tcBorders>
-          </w:tcPr>
-          <w:p>
-            <w:pPr>
-              <w:spacing w:line="360" w:lineRule="auto"/>
-            </w:pPr>
-            <w:r>
-              <w:rPr>
-                <w:rFonts w:ascii="inter" w:eastAsia="inter" w:hAnsi="inter" w:cs="inter"/>
-                <w:sz w:val="17"/>
-              </w:rPr>
-              <w:t>Method</w:t>
-            </w:r>
-          </w:p>
-        </w:tc>
-        <w:tc>
-          <w:tcPr>
-            <w:tcW w:w="0" w:type="auto"/>
-            <w:tcBorders>
-              <w:top w:val="single" w:sz="1" w:space="0" w:color="000000"/>
-              <w:bottom w:val="single" w:sz="1" w:space="0" w:color="000000"/>
-              <w:right w:val="single" w:sz="1" w:space="0" w:color="000000"/>
-            </w:tcBorders>
-          </w:tcPr>
-          <w:p>
-            <w:pPr>
-              <w:spacing w:line="360" w:lineRule="auto"/>
-            </w:pPr>
-            <w:r>
-              <w:rPr>
-                <w:rFonts w:ascii="inter" w:eastAsia="inter" w:hAnsi="inter" w:cs="inter"/>
-                <w:sz w:val="17"/>
-              </w:rPr>
-              <w:t>Improvement</w:t>
-            </w:r>
-          </w:p>
-        </w:tc>
-        <w:tc>
-          <w:tcPr>
-            <w:tcW w:w="0" w:type="auto"/>
-            <w:tcBorders>
-              <w:top w:val="single" w:sz="1" w:space="0" w:color="000000"/>
-              <w:bottom w:val="single" w:sz="1" w:space="0" w:color="000000"/>
-            </w:tcBorders>
-          </w:tcPr>
-          <w:p>
-            <w:pPr>
-              <w:spacing w:line="360" w:lineRule="auto"/>
-            </w:pPr>
-            <w:r>
-              <w:rPr>
-                <w:rFonts w:ascii="inter" w:eastAsia="inter" w:hAnsi="inter" w:cs="inter"/>
-                <w:sz w:val="17"/>
-              </w:rPr>
-              <w:t>Source</w:t>
-            </w:r>
-          </w:p>
-        </w:tc>
-      </w:tr>
-      <w:tr>
-        <w:trPr>
-          <w:cantSplit/>
-          <w:tblCellSpacing w:w="0" w:type="dxa"/>
-          <w:jc w:val="center"/>
-        </w:trPr>
-        <w:tc>
-          <w:tcPr>
-            <w:tcW w:w="0" w:type="auto"/>
-            <w:tcBorders>
-              <w:top w:val="single" w:sz="1" w:space="0" w:color="000000"/>
-              <w:bottom w:val="single" w:sz="1" w:space="0" w:color="000000"/>
-              <w:right w:val="single" w:sz="1" w:space="0" w:color="000000"/>
-            </w:tcBorders>
-          </w:tcPr>
-          <w:p>
-            <w:pPr>
-              <w:spacing w:line="360" w:lineRule="auto"/>
-            </w:pPr>
-            <w:r>
-              <w:rPr>
-                <w:rFonts w:ascii="inter" w:eastAsia="inter" w:hAnsi="inter" w:cs="inter"/>
-                <w:sz w:val="17"/>
-              </w:rPr>
-              <w:t>SIMD NEON</w:t>
-            </w:r>
-          </w:p>
-        </w:tc>
-        <w:tc>
-          <w:tcPr>
-            <w:tcW w:w="0" w:type="auto"/>
-            <w:tcBorders>
-              <w:top w:val="single" w:sz="1" w:space="0" w:color="000000"/>
-              <w:bottom w:val="single" w:sz="1" w:space="0" w:color="000000"/>
-              <w:right w:val="single" w:sz="1" w:space="0" w:color="000000"/>
-            </w:tcBorders>
-          </w:tcPr>
-          <w:p>
-            <w:pPr>
-              <w:spacing w:line="360" w:lineRule="auto"/>
-            </w:pPr>
-            <w:r>
-              <w:rPr>
-                <w:rFonts w:ascii="inter" w:eastAsia="inter" w:hAnsi="inter" w:cs="inter"/>
-                <w:sz w:val="17"/>
-              </w:rPr>
-              <w:t>1.7× speedup</w:t>
-            </w:r>
-          </w:p>
-        </w:tc>
-        <w:tc>
-          <w:tcPr>
-            <w:tcW w:w="0" w:type="auto"/>
-            <w:tcBorders>
-              <w:top w:val="single" w:sz="1" w:space="0" w:color="000000"/>
-              <w:bottom w:val="single" w:sz="1" w:space="0" w:color="000000"/>
-            </w:tcBorders>
-          </w:tcPr>
-          <w:p>
-            <w:pPr>
-              <w:spacing w:line="360" w:lineRule="auto"/>
-            </w:pPr>
-            <w:r>
-              <w:rPr>
-                <w:rFonts w:ascii="inter" w:eastAsia="inter" w:hAnsi="inter" w:cs="inter"/>
-                <w:sz w:val="17"/>
-              </w:rPr>
-              <w:t>SR22</w:t>
-            </w:r>
-          </w:p>
-        </w:tc>
-      </w:tr>
-      <w:tr>
-        <w:trPr>
-          <w:cantSplit/>
-          <w:tblCellSpacing w:w="0" w:type="dxa"/>
-          <w:jc w:val="center"/>
-        </w:trPr>
-        <w:tc>
-          <w:tcPr>
-            <w:tcW w:w="0" w:type="auto"/>
-            <w:tcBorders>
-              <w:top w:val="single" w:sz="1" w:space="0" w:color="000000"/>
-              <w:bottom w:val="single" w:sz="1" w:space="0" w:color="000000"/>
-              <w:right w:val="single" w:sz="1" w:space="0" w:color="000000"/>
-            </w:tcBorders>
-          </w:tcPr>
-          <w:p>
-            <w:pPr>
-              <w:spacing w:line="360" w:lineRule="auto"/>
-            </w:pPr>
-            <w:r>
-              <w:rPr>
-                <w:rFonts w:ascii="inter" w:eastAsia="inter" w:hAnsi="inter" w:cs="inter"/>
-                <w:sz w:val="17"/>
-              </w:rPr>
-              <w:t>Model Quantization</w:t>
-            </w:r>
-          </w:p>
-        </w:tc>
-        <w:tc>
-          <w:tcPr>
-            <w:tcW w:w="0" w:type="auto"/>
-            <w:tcBorders>
-              <w:top w:val="single" w:sz="1" w:space="0" w:color="000000"/>
-              <w:bottom w:val="single" w:sz="1" w:space="0" w:color="000000"/>
-              <w:right w:val="single" w:sz="1" w:space="0" w:color="000000"/>
-            </w:tcBorders>
-          </w:tcPr>
-          <w:p>
-            <w:pPr>
-              <w:spacing w:line="360" w:lineRule="auto"/>
-            </w:pPr>
-            <w:r>
-              <w:rPr>
-                <w:rFonts w:ascii="inter" w:eastAsia="inter" w:hAnsi="inter" w:cs="inter"/>
-                <w:sz w:val="17"/>
-              </w:rPr>
-              <w:t>3.2× faster</w:t>
-            </w:r>
-          </w:p>
-        </w:tc>
-        <w:tc>
-          <w:tcPr>
-            <w:tcW w:w="0" w:type="auto"/>
-            <w:tcBorders>
-              <w:top w:val="single" w:sz="1" w:space="0" w:color="000000"/>
-              <w:bottom w:val="single" w:sz="1" w:space="0" w:color="000000"/>
-            </w:tcBorders>
-          </w:tcPr>
-          <w:p>
-            <w:pPr>
-              <w:spacing w:line="360" w:lineRule="auto"/>
-            </w:pPr>
-            <w:r>
-              <w:rPr>
-                <w:rFonts w:ascii="inter" w:eastAsia="inter" w:hAnsi="inter" w:cs="inter"/>
-                <w:sz w:val="17"/>
-              </w:rPr>
-              <w:t>SR24</w:t>
-            </w:r>
-          </w:p>
-        </w:tc>
-      </w:tr>
-      <w:tr>
-        <w:trPr>
-          <w:cantSplit/>
-          <w:tblCellSpacing w:w="0" w:type="dxa"/>
-          <w:jc w:val="center"/>
-        </w:trPr>
-        <w:tc>
-          <w:tcPr>
-            <w:tcW w:w="0" w:type="auto"/>
-            <w:tcBorders>
-              <w:top w:val="single" w:sz="1" w:space="0" w:color="000000"/>
-              <w:bottom w:val="single" w:sz="1" w:space="0" w:color="000000"/>
-              <w:right w:val="single" w:sz="1" w:space="0" w:color="000000"/>
-            </w:tcBorders>
-          </w:tcPr>
-          <w:p>
-            <w:pPr>
-              <w:spacing w:line="360" w:lineRule="auto"/>
-            </w:pPr>
-            <w:r>
-              <w:rPr>
-                <w:rFonts w:ascii="inter" w:eastAsia="inter" w:hAnsi="inter" w:cs="inter"/>
-                <w:sz w:val="17"/>
-              </w:rPr>
-              <w:t>Thread Pooling</w:t>
-            </w:r>
-          </w:p>
-        </w:tc>
-        <w:tc>
-          <w:tcPr>
-            <w:tcW w:w="0" w:type="auto"/>
-            <w:tcBorders>
-              <w:top w:val="single" w:sz="1" w:space="0" w:color="000000"/>
-              <w:bottom w:val="single" w:sz="1" w:space="0" w:color="000000"/>
-              <w:right w:val="single" w:sz="1" w:space="0" w:color="000000"/>
-            </w:tcBorders>
-          </w:tcPr>
-          <w:p>
-            <w:pPr>
-              <w:spacing w:line="360" w:lineRule="auto"/>
-            </w:pPr>
-            <w:r>
-              <w:rPr>
-                <w:rFonts w:ascii="inter" w:eastAsia="inter" w:hAnsi="inter" w:cs="inter"/>
-                <w:sz w:val="17"/>
-              </w:rPr>
-              <w:t>40% CPU utilization</w:t>
-            </w:r>
-          </w:p>
-        </w:tc>
-        <w:tc>
-          <w:tcPr>
-            <w:tcW w:w="0" w:type="auto"/>
-            <w:tcBorders>
-              <w:top w:val="single" w:sz="1" w:space="0" w:color="000000"/>
-              <w:bottom w:val="single" w:sz="1" w:space="0" w:color="000000"/>
-            </w:tcBorders>
-          </w:tcPr>
-          <w:p>
-            <w:pPr>
-              <w:spacing w:line="360" w:lineRule="auto"/>
-            </w:pPr>
-            <w:r>
-              <w:rPr>
-                <w:rFonts w:ascii="inter" w:eastAsia="inter" w:hAnsi="inter" w:cs="inter"/>
-                <w:sz w:val="17"/>
-              </w:rPr>
-              <w:t>SR16</w:t>
-            </w:r>
-          </w:p>
-        </w:tc>
-      </w:tr>
-    </w:tbl>
-    <w:p/>
-    <w:p>
-      <w:pPr>
-        <w:spacing w:after="210" w:line="360" w:lineRule="auto"/>
-      </w:pPr>
-      <w:r>
-        <w:rPr>
-          <w:rFonts w:ascii="inter" w:eastAsia="inter" w:hAnsi="inter" w:cs="inter"/>
-        </w:rPr>
-        <w:t>Achieved 8 FPS object detection on Pi 5 vs 1.5 FPS on Pi 4 (YouTube Benchmark SR26).</w:t>
-      </w:r>
-    </w:p>
-    <w:p>
-      <w:pPr>
-        <w:spacing w:before="210" w:after="0" w:line="360" w:lineRule="auto"/>
-      </w:pPr>
-      <w:r>
-        <w:rPr>
-          <w:noProof/>
-        </w:rPr>
-        <mc:AlternateContent>
-          <mc:Choice Requires="wps">
-            <w:drawing>
-              <wp:inline distT="0" distB="0" distL="0" distR="0" wp14:anchorId="4553635E" wp14:editId="2B17E305">
-                <wp:extent cx="6038850" cy="635"/>
-                <wp:effectExtent l="0" t="0" r="19050" b="24765"/>
-                <wp:docPr id="1771236990" name="Rectangle 4"/>
-                <wp:cNvGraphicFramePr>
-                  <a:graphicFrameLocks xmlns:a="http://schemas.openxmlformats.org/drawingml/2006/main"/>
-                </wp:cNvGraphicFramePr>
-                <a:graphic xmlns:a="http://schemas.openxmlformats.org/drawingml/2006/main">
-                  <a:graphicData uri="http://schemas.microsoft.com/office/word/2010/wordprocessingShape">
-                    <wps:wsp>
-                      <wps:cNvSpPr>
-                        <a:spLocks/>
-                      </wps:cNvSpPr>
-                      <wps:spPr bwMode="auto">
-                        <a:xfrm>
-                          <a:off x="0" y="0"/>
-                          <a:ext cx="6038850" cy="635"/>
-                        </a:xfrm>
-                        <a:prstGeom prst="rect">
-                          <a:avLst/>
-                        </a:prstGeom>
-                        <a:solidFill>
-                          <a:srgbClr val="FFFFFF"/>
-                        </a:solidFill>
-                        <a:ln w="12700">
-                          <a:solidFill>
-                            <a:srgbClr val="000000">
-                              <a:alpha val="0"/>
-                            </a:srgbClr>
-                          </a:solidFill>
-                          <a:miter lim="800000"/>
-                          <a:headEnd/>
-                          <a:tailEnd/>
-                        </a:ln>
-                      </wps:spPr>
-                      <wps:bodyPr rot="0" vert="horz" wrap="square" lIns="91440" tIns="45720" rIns="91440" bIns="45720" anchor="t" anchorCtr="0" upright="1">
-                        <a:noAutofit/>
-                      </wps:bodyPr>
-                    </wps:wsp>
-                  </a:graphicData>
-                </a:graphic>
-              </wp:inline>
-            </w:drawing>
-          </mc:Choice>
-          <mc:Fallback>
-            <w:pict>
-              <v:rect w14:anchorId="02D249B8" id="Rectangle 4" o:spid="_x0000_s1026" style="width:475.5pt;height:.05pt;visibility:visible;mso-wrap-style:square;mso-left-percent:-10001;mso-top-percent:-10001;mso-position-horizontal:absolute;mso-position-horizontal-relative:char;mso-position-vertical:absolute;mso-position-vertical-relative:line;mso-left-percent:-10001;mso-top-percent:-10001;v-text-anchor:top" o:gfxdata="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" strokeweight="1pt">
-                <v:stroke opacity="0"/>
-                <v:path arrowok="t"/>
-                <w10:anchorlock/>
-              </v:rect>
-            </w:pict>
-          </mc:Fallback>
-        </mc:AlternateContent>
-      </w:r>
-    </w:p>
-    <w:p>
-      <w:pPr>
-        <w:spacing w:before="315" w:after="105" w:line="360" w:lineRule="auto"/>
-        <w:ind w:left="-30"/>
-      </w:pPr>
-      <w:r>
-        <w:rPr>
-          <w:rFonts w:ascii="inter" w:eastAsia="inter" w:hAnsi="inter" w:cs="inter"/>
-          <w:b/>
-          <w:sz w:val="24"/>
-        </w:rPr>
-        <w:t>Future Development Roadmap</w:t>
-      </w:r>
-    </w:p>
-    <w:p>
-      <w:pPr>
-        <w:spacing w:before="315" w:after="105" w:line="360" w:lineRule="auto"/>
-        <w:ind w:left="-30"/>
-      </w:pPr>
-      <w:r>
-        <w:rPr>
-          <w:rFonts w:ascii="inter" w:eastAsia="inter" w:hAnsi="inter" w:cs="inter"/>
-          <w:b/>
-          <w:sz w:val="24"/>
-        </w:rPr>
-        <w:t>Hardware Upgrades</w:t>
-      </w:r>
-    </w:p>
-    <w:p>
-      <w:pPr>
-        <w:numPr>
-          <w:ilvl w:val="0"/>
-          <w:numId w:val="16"/>
-        </w:numPr>
-        <w:spacing w:before="105" w:after="105" w:line="360" w:lineRule="auto"/>
-      </w:pPr>
-      <w:r>
-        <w:rPr>
-          <w:rFonts w:ascii="inter" w:eastAsia="inter" w:hAnsi="inter" w:cs="inter"/>
-          <w:b/>
-        </w:rPr>
-        <w:t>Google Coral USB</w:t>
-      </w:r>
-      <w:r>
-        <w:rPr>
-          <w:rFonts w:ascii="inter" w:eastAsia="inter" w:hAnsi="inter" w:cs="inter"/>
-        </w:rPr>
-        <w:t>: 15 TOPS Edge TPU ($60)</w:t>
-      </w:r>
-    </w:p>
-    <w:p>
-      <w:pPr>
-        <w:numPr>
-          <w:ilvl w:val="0"/>
-          <w:numId w:val="16"/>
-        </w:numPr>
-        <w:spacing w:before="105" w:after="105" w:line="360" w:lineRule="auto"/>
-      </w:pPr>
-      <w:proofErr w:type="spellStart"/>
-      <w:r>
-        <w:rPr>
-          <w:rFonts w:ascii="inter" w:eastAsia="inter" w:hAnsi="inter" w:cs="inter"/>
-          <w:b/>
-        </w:rPr>
-        <w:t>Luxonis</w:t>
-      </w:r>
-      <w:proofErr w:type="spellEnd"/>
-      <w:r>
-        <w:rPr>
-          <w:rFonts w:ascii="inter" w:eastAsia="inter" w:hAnsi="inter" w:cs="inter"/>
-          <w:b/>
-        </w:rPr>
-        <w:t xml:space="preserve"> OAK-D</w:t>
-      </w:r>
-      <w:r>
-        <w:rPr>
-          <w:rFonts w:ascii="inter" w:eastAsia="inter" w:hAnsi="inter" w:cs="inter"/>
-        </w:rPr>
-        <w:t>: 4K/60 Spatial AI ($149)</w:t>
-      </w:r>
-    </w:p>
-    <w:p>
-      <w:pPr>
-        <w:spacing w:before="315" w:after="105" w:line="360" w:lineRule="auto"/>
-        <w:ind w:left="-30"/>
-      </w:pPr>
-      <w:r>
-        <w:rPr>
-          <w:rFonts w:ascii="inter" w:eastAsia="inter" w:hAnsi="inter" w:cs="inter"/>
-          <w:b/>
-          <w:sz w:val="24"/>
-        </w:rPr>
-        <w:t>Software Enhancements</w:t>
-      </w:r>
-    </w:p>
-    <w:p>
-      <w:pPr>
-        <w:numPr>
-          <w:ilvl w:val="0"/>
-          <w:numId w:val="17"/>
-        </w:numPr>
-        <w:spacing w:before="105" w:after="105" w:line="360" w:lineRule="auto"/>
-      </w:pPr>
-      <w:r>
-        <w:rPr>
-          <w:rFonts w:ascii="inter" w:eastAsia="inter" w:hAnsi="inter" w:cs="inter"/>
-        </w:rPr>
-        <w:t>Federated learning for personalized note recognition</w:t>
-      </w:r>
-    </w:p>
-    <w:p>
-      <w:pPr>
-        <w:numPr>
-          <w:ilvl w:val="0"/>
-          <w:numId w:val="17"/>
-        </w:numPr>
-        <w:spacing w:before="105" w:after="105" w:line="360" w:lineRule="auto"/>
-      </w:pPr>
-      <w:r>
-        <w:rPr>
-          <w:rFonts w:ascii="inter" w:eastAsia="inter" w:hAnsi="inter" w:cs="inter"/>
-        </w:rPr>
-        <w:t>RTSP streaming integration with Home Assistant</w:t>
-      </w:r>
-    </w:p>
-    <w:p>
-      <w:pPr>
-        <w:spacing w:before="315" w:after="105" w:line="360" w:lineRule="auto"/>
-        <w:ind w:left="-30"/>
-      </w:pPr>
-      <w:r>
-        <w:rPr>
-          <w:rFonts w:ascii="inter" w:eastAsia="inter" w:hAnsi="inter" w:cs="inter"/>
-          <w:b/>
-          <w:sz w:val="24"/>
-        </w:rPr>
-        <w:t>Market Expansion</w:t>
-      </w:r>
-    </w:p>
-    <w:tbl>
-      <w:tblPr>
-        <w:tblStyle w:val="NormalGrid"/>
-        <w:tblW w:w="0" w:type="auto"/>
-        <w:jc w:val="center"/>
-        <w:tblCellSpacing w:w="0" w:type="dxa"/>
-        <w:tblBorders>
-          <w:top w:val="single" w:sz="2" w:space="0" w:color="000000"/>
-          <w:left w:val="single" w:sz="2" w:space="0" w:color="000000"/>
-          <w:bottom w:val="single" w:sz="2" w:space="0" w:color="000000"/>
-          <w:right w:val="single" w:sz="2" w:space="0" w:color="000000"/>
-        </w:tblBorders>
-        <w:tblLook w:val="04A0" w:firstRow="1" w:lastRow="0" w:firstColumn="1" w:lastColumn="0" w:noHBand="0" w:noVBand="1"/>
-      </w:tblPr>
-      <w:tblGrid>
-        <w:gridCol w:w="1235"/>
-        <w:gridCol w:w="1647"/>
-        <w:gridCol w:w="971"/>
+        <w:gridCol w:w="790"/>
+        <w:gridCol w:w="1084"/>
+        <w:gridCol w:w="1754"/>
       </w:tblGrid>
       <w:tr>
         <w:trPr>
@@ -11505,7 +11508,7 @@
                 <w:rFonts w:ascii="inter" w:eastAsia="inter" w:hAnsi="inter" w:cs="inter"/>
                 <w:sz w:val="17"/>
               </w:rPr>
-              <w:t>Potential Revenue</w:t>
+              <w:t>2026 TAM</w:t>
             </w:r>
           </w:p>
         </w:tc>
@@ -11526,223 +11529,7 @@
                 <w:rFonts w:ascii="inter" w:eastAsia="inter" w:hAnsi="inter" w:cs="inter"/>
                 <w:sz w:val="17"/>
               </w:rPr>
-              <w:t>Timeline</w:t>
-            </w:r>
-          </w:p>
-        </w:tc>
-      </w:tr>
-      <w:tr>
-        <w:trPr>
-          <w:cantSplit/>
-          <w:tblCellSpacing w:w="0" w:type="dxa"/>
-          <w:jc w:val="center"/>
-        </w:trPr>
-        <w:tc>
-          <w:tcPr>
-            <w:tcW w:w="0" w:type="auto"/>
-            <w:tcBorders>
-              <w:top w:val="single" w:sz="1" w:space="0" w:color="000000"/>
-              <w:bottom w:val="single" w:sz="1" w:space="0" w:color="000000"/>
-              <w:right w:val="single" w:sz="1" w:space="0" w:color="000000"/>
-            </w:tcBorders>
-          </w:tcPr>
-          <w:p>
-            <w:pPr>
-              <w:spacing w:line="360" w:lineRule="auto"/>
-            </w:pPr>
-            <w:r>
-              <w:rPr>
-                <w:rFonts w:ascii="inter" w:eastAsia="inter" w:hAnsi="inter" w:cs="inter"/>
-                <w:sz w:val="17"/>
-              </w:rPr>
-              <w:t>Pharma</w:t>
-            </w:r>
-          </w:p>
-        </w:tc>
-        <w:tc>
-          <w:tcPr>
-            <w:tcW w:w="0" w:type="auto"/>
-            <w:tcBorders>
-              <w:top w:val="single" w:sz="1" w:space="0" w:color="000000"/>
-              <w:bottom w:val="single" w:sz="1" w:space="0" w:color="000000"/>
-              <w:right w:val="single" w:sz="1" w:space="0" w:color="000000"/>
-            </w:tcBorders>
-          </w:tcPr>
-          <w:p>
-            <w:pPr>
-              <w:spacing w:line="360" w:lineRule="auto"/>
-            </w:pPr>
-            <w:r>
-              <w:rPr>
-                <w:rFonts w:ascii="inter" w:eastAsia="inter" w:hAnsi="inter" w:cs="inter"/>
-                <w:sz w:val="17"/>
-              </w:rPr>
-              <w:t>$4.2B pill sorting</w:t>
-            </w:r>
-          </w:p>
-        </w:tc>
-        <w:tc>
-          <w:tcPr>
-            <w:tcW w:w="0" w:type="auto"/>
-            <w:tcBorders>
-              <w:top w:val="single" w:sz="1" w:space="0" w:color="000000"/>
-              <w:bottom w:val="single" w:sz="1" w:space="0" w:color="000000"/>
-            </w:tcBorders>
-          </w:tcPr>
-          <w:p>
-            <w:pPr>
-              <w:spacing w:line="360" w:lineRule="auto"/>
-            </w:pPr>
-            <w:r>
-              <w:rPr>
-                <w:rFonts w:ascii="inter" w:eastAsia="inter" w:hAnsi="inter" w:cs="inter"/>
-                <w:sz w:val="17"/>
-              </w:rPr>
-              <w:t>2026</w:t>
-            </w:r>
-          </w:p>
-        </w:tc>
-      </w:tr>
-      <w:tr>
-        <w:trPr>
-          <w:cantSplit/>
-          <w:tblCellSpacing w:w="0" w:type="dxa"/>
-          <w:jc w:val="center"/>
-        </w:trPr>
-        <w:tc>
-          <w:tcPr>
-            <w:tcW w:w="0" w:type="auto"/>
-            <w:tcBorders>
-              <w:top w:val="single" w:sz="1" w:space="0" w:color="000000"/>
-              <w:bottom w:val="single" w:sz="1" w:space="0" w:color="000000"/>
-              <w:right w:val="single" w:sz="1" w:space="0" w:color="000000"/>
-            </w:tcBorders>
-          </w:tcPr>
-          <w:p>
-            <w:pPr>
-              <w:spacing w:line="360" w:lineRule="auto"/>
-            </w:pPr>
-            <w:r>
-              <w:rPr>
-                <w:rFonts w:ascii="inter" w:eastAsia="inter" w:hAnsi="inter" w:cs="inter"/>
-                <w:sz w:val="17"/>
-              </w:rPr>
-              <w:t>EdTech</w:t>
-            </w:r>
-          </w:p>
-        </w:tc>
-        <w:tc>
-          <w:tcPr>
-            <w:tcW w:w="0" w:type="auto"/>
-            <w:tcBorders>
-              <w:top w:val="single" w:sz="1" w:space="0" w:color="000000"/>
-              <w:bottom w:val="single" w:sz="1" w:space="0" w:color="000000"/>
-              <w:right w:val="single" w:sz="1" w:space="0" w:color="000000"/>
-            </w:tcBorders>
-          </w:tcPr>
-          <w:p>
-            <w:pPr>
-              <w:spacing w:line="360" w:lineRule="auto"/>
-            </w:pPr>
-            <w:r>
-              <w:rPr>
-                <w:rFonts w:ascii="inter" w:eastAsia="inter" w:hAnsi="inter" w:cs="inter"/>
-                <w:sz w:val="17"/>
-              </w:rPr>
-              <w:t>$32B note-taking</w:t>
-            </w:r>
-          </w:p>
-        </w:tc>
-        <w:tc>
-          <w:tcPr>
-            <w:tcW w:w="0" w:type="auto"/>
-            <w:tcBorders>
-              <w:top w:val="single" w:sz="1" w:space="0" w:color="000000"/>
-              <w:bottom w:val="single" w:sz="1" w:space="0" w:color="000000"/>
-            </w:tcBorders>
-          </w:tcPr>
-          <w:p>
-            <w:pPr>
-              <w:spacing w:line="360" w:lineRule="auto"/>
-            </w:pPr>
-            <w:r>
-              <w:rPr>
-                <w:rFonts w:ascii="inter" w:eastAsia="inter" w:hAnsi="inter" w:cs="inter"/>
-                <w:sz w:val="17"/>
-              </w:rPr>
-              <w:t>2025</w:t>
-            </w:r>
-          </w:p>
-        </w:tc>
-      </w:tr>
-      <w:tr>
-        <w:trPr>
-          <w:cantSplit/>
-          <w:tblCellSpacing w:w="0" w:type="dxa"/>
-          <w:jc w:val="center"/>
-        </w:trPr>
-        <w:tc>
-          <w:tcPr>
-            <w:tcW w:w="0" w:type="auto"/>
-            <w:tcBorders>
-              <w:top w:val="single" w:sz="1" w:space="0" w:color="000000"/>
-              <w:bottom w:val="single" w:sz="1" w:space="0" w:color="000000"/>
-              <w:right w:val="single" w:sz="1" w:space="0" w:color="000000"/>
-            </w:tcBorders>
-          </w:tcPr>
-          <w:p>
-            <w:pPr>
-              <w:spacing w:line="360" w:lineRule="auto"/>
-            </w:pPr>
-            <w:r>
-              <w:rPr>
-                <w:rFonts w:ascii="inter" w:eastAsia="inter" w:hAnsi="inter" w:cs="inter"/>
-                <w:sz w:val="17"/>
-              </w:rPr>
-              <w:t>Smart Home</w:t>
-            </w:r>
-          </w:p>
-        </w:tc>
-        <w:tc>
-          <w:tcPr>
-            <w:tcW w:w="0" w:type="auto"/>
-            <w:tcBorders>
-              <w:top w:val="single" w:sz="1" w:space="0" w:color="000000"/>
-              <w:bottom w:val="single" w:sz="1" w:space="0" w:color="000000"/>
-              <w:right w:val="single" w:sz="1" w:space="0" w:color="000000"/>
-            </w:tcBorders>
-          </w:tcPr>
-          <w:p>
-            <w:pPr>
-              <w:spacing w:line="360" w:lineRule="auto"/>
-            </w:pPr>
-            <w:r>
-              <w:rPr>
-                <w:rFonts w:ascii="inter" w:eastAsia="inter" w:hAnsi="inter" w:cs="inter"/>
-                <w:sz w:val="17"/>
-              </w:rPr>
-              <w:t>$15B org tools</w:t>
-            </w:r>
-          </w:p>
-        </w:tc>
-        <w:tc>
-          <w:tcPr>
-            <w:tcW w:w="0" w:type="auto"/>
-            <w:tcBorders>
-              <w:top w:val="single" w:sz="1" w:space="0" w:color="000000"/>
-              <w:bottom w:val="single" w:sz="1" w:space="0" w:color="000000"/>
-            </w:tcBorders>
-          </w:tcPr>
-          <w:p>
-            <w:pPr>
-              <w:spacing w:line="360" w:lineRule="auto"/>
-            </w:pPr>
-            <w:r>
-              <w:rPr>
-                <w:rFonts w:ascii="inter" w:eastAsia="inter" w:hAnsi="inter" w:cs="inter"/>
-                <w:sz w:val="17"/>
-              </w:rPr>
-              <w:t>2027</w:t>
+              <w:t>Our Solution's Edge</w:t>
             </w:r>
           </w:p>
         </w:tc>
@@ -11838,7 +11625,6 @@
         <w:rPr>
           <w:rFonts w:ascii="inter" w:eastAsia="inter" w:hAnsi="inter" w:cs="inter"/>
         </w:rPr>
-        <w:lastRenderedPageBreak/>
         <w:t>SmartVision demonstrates that open-source ecosystems now rival proprietary solutions, achieving 70% of commercial capabilities at 10% cost. By combining Raspberry Pi's accessibility with industrial-grade computer vision techniques, we enable:</w:t>
       </w:r>
     </w:p>
@@ -11869,6 +11655,7 @@
         <w:rPr>
           <w:rFonts w:ascii="inter" w:eastAsia="inter" w:hAnsi="inter" w:cs="inter"/>
         </w:rPr>
+        <w:lastRenderedPageBreak/>
         <w:t>Scalable small-batch manufacturing QC</w:t>
       </w:r>
     </w:p>
@@ -12604,7 +12391,6 @@
           </w:tcPr>
           <w:p>
             <w:r>
-              <w:lastRenderedPageBreak/>
               <w:t>Real-time ML on Pi</w:t>
             </w:r>
           </w:p>
@@ -12766,7 +12552,11 @@
         <w:ind w:left="587" w:right="27" w:hanging="120"/>
       </w:pPr>
       <w:r>
-        <w:t>. Enhancing Accessibility to Advanced Tools: Open-source tools and affordable hardware often lack comprehensive documentation and beginner-friendly examples. By creating a modular, AI-powered camera system, this project aims to make advanced computer vision techniques more accessible to learners and developers.</w:t>
+        <w:t xml:space="preserve">. Enhancing Accessibility to Advanced Tools: Open-source tools and affordable hardware often lack comprehensive documentation and beginner-friendly examples. By creating a modular, AI-powered camera </w:t>
+      </w:r>
+      <w:r>
+        <w:lastRenderedPageBreak/>
+        <w:t>system, this project aims to make advanced computer vision techniques more accessible to learners and developers.</w:t>
       </w:r>
     </w:p>
     <w:p>
@@ -12967,7 +12757,6 @@
           <w:noProof/>
           <w:sz w:val="22"/>
         </w:rPr>
-        <w:lastRenderedPageBreak/>
         <mc:AlternateContent>
           <mc:Choice Requires="wpg">
             <w:drawing>
@@ -14620,7 +14409,11 @@
         <w:ind w:right="27"/>
       </w:pPr>
       <w:r>
-        <w:t>The project is designed to be accessible to a wide range of users, from students and educators to hobbyists and professionals. It emphasizes the importance of understanding the underlying principles of machine learning and computer vision, rather than simply providing code snippets without context. By offering detailed explanations, real-world examples, and opportunities for experimentation, we hope to empower learners to explore the full potential of these technologies.</w:t>
+        <w:t>The project is designed to be accessible to a wide range of users, from students and educators to hobbyists and professionals. It emphasizes the importance of understanding the underlying principles of machine learning and computer vision, rather than simply providing code snippets without context. By offering detailed explanations, real-</w:t>
+      </w:r>
+      <w:r>
+        <w:lastRenderedPageBreak/>
+        <w:t>world examples, and opportunities for experimentation, we hope to empower learners to explore the full potential of these technologies.</w:t>
       </w:r>
     </w:p>
     <w:p>
@@ -16067,7 +15860,6 @@
           <w:noProof/>
           <w:sz w:val="22"/>
         </w:rPr>
-        <w:lastRenderedPageBreak/>
         <mc:AlternateContent>
           <mc:Choice Requires="wpg">
             <w:drawing>
@@ -16924,7 +16716,11 @@
         <w:ind w:right="27"/>
       </w:pPr>
       <w:r>
-        <w:t>For instance, a beginner might follow a tutorial on object detection using OpenCV but find themselves lost when trying to apply the same techniques to a different dataset or use case. They may not understand how to adjust the parameters for different lighting conditions or hardware setups, leading to frustration and a lack of confidence in their abilities. This is particularly evident in the field of computer vision, where the same algorithms can yield vastly different results depending on the context in which they are applied. For example, a color detection algorithm that works well in one lighting condition may fail miserably in another, but many tutorials do not provide guidance on how to adapt to these changes. This lack of context and depth can lead to confusion and frustration for learners, who may feel overwhelmed by the complexity of the subject matter. They may also struggle to apply what they've learned to real-world problems, as they lack the foundational understanding needed to adapt and innovate. For instance, a beginner might follow a tutorial on object detection using OpenCV but find themselves lost when trying to apply the same techniques to a different dataset or use case. They may not understand how to adjust the parameters for different lighting conditions or hardware setups, leading to frustration and a lack of confidence in their abilities.</w:t>
+        <w:t xml:space="preserve">For instance, a beginner might follow a tutorial on object detection using OpenCV but find themselves lost when trying to apply the same techniques to a different dataset or use case. They may not understand how to adjust the parameters for different lighting conditions or hardware setups, leading to frustration and a lack of confidence in their abilities. This is particularly evident in the field of computer vision, where the same algorithms can yield vastly different results depending on the context in which they are applied. For example, a color detection algorithm that works well in one lighting condition may fail miserably in another, but many tutorials do not provide guidance on how to adapt to these changes. This lack of context and depth can lead to confusion and frustration for learners, who may feel </w:t>
+      </w:r>
+      <w:r>
+        <w:lastRenderedPageBreak/>
+        <w:t>overwhelmed by the complexity of the subject matter. They may also struggle to apply what they've learned to real-world problems, as they lack the foundational understanding needed to adapt and innovate. For instance, a beginner might follow a tutorial on object detection using OpenCV but find themselves lost when trying to apply the same techniques to a different dataset or use case. They may not understand how to adjust the parameters for different lighting conditions or hardware setups, leading to frustration and a lack of confidence in their abilities.</w:t>
       </w:r>
     </w:p>
     <w:p>
@@ -17707,7 +17503,6 @@
         <w:ind w:left="-5"/>
       </w:pPr>
       <w:r>
-        <w:lastRenderedPageBreak/>
         <w:t>Executive Summary</w:t>
       </w:r>
     </w:p>
@@ -17744,6 +17539,7 @@
         <w:ind w:right="27"/>
       </w:pPr>
       <w:r>
+        <w:lastRenderedPageBreak/>
         <w:t>This report provides a comprehensive overview of the journey, detailing the challenges faced, solutions implemented, and future possibilities. It highlights the value of combining open-source software with affordable hardware to create impactful, scalable solutions for diverse applications.</w:t>
       </w:r>
     </w:p>
@@ -19351,7 +19147,6 @@
         <w:rPr>
           <w:rFonts w:ascii="inter" w:eastAsia="inter" w:hAnsi="inter" w:cs="inter"/>
         </w:rPr>
-        <w:lastRenderedPageBreak/>
         <w:t>Developed automated bash scripts (</w:t>
       </w:r>
       <w:r>
@@ -19363,8 +19158,8 @@
         </w:rPr>
         <w:t>setup_env.sh</w:t>
       </w:r>
-      <w:bookmarkStart w:id="3" w:name="fnref1"/>
-      <w:bookmarkEnd w:id="3"/>
+      <w:bookmarkStart w:id="4" w:name="fnref1"/>
+      <w:bookmarkEnd w:id="4"/>
       <w:r>
         <w:rPr>
           <w:rFonts w:ascii="inter" w:eastAsia="inter" w:hAnsi="inter" w:cs="inter"/>
@@ -19398,10 +19193,10 @@
         </w:rPr>
         <w:t>with GPU-accelerated kernels</w:t>
       </w:r>
-      <w:bookmarkStart w:id="4" w:name="fnref2"/>
-      <w:bookmarkStart w:id="5" w:name="fnref3"/>
-      <w:bookmarkEnd w:id="4"/>
+      <w:bookmarkStart w:id="5" w:name="fnref2"/>
+      <w:bookmarkStart w:id="6" w:name="fnref3"/>
       <w:bookmarkEnd w:id="5"/>
+      <w:bookmarkEnd w:id="6"/>
     </w:p>
     <w:p>
       <w:pPr>
@@ -19514,6 +19309,7 @@
         <w:spacing w:after="210" w:line="240" w:lineRule="auto"/>
       </w:pPr>
       <w:r>
+        <w:lastRenderedPageBreak/>
         <w:t>Camera</w:t>
       </w:r>
     </w:p>
@@ -19766,7 +19562,6 @@
         <w:spacing w:after="210" w:line="240" w:lineRule="auto"/>
       </w:pPr>
       <w:r>
-        <w:lastRenderedPageBreak/>
         <w:t>Drawing Rectangles</w:t>
       </w:r>
     </w:p>
@@ -23173,7 +22968,6 @@
         <w:rPr>
           <w:noProof/>
         </w:rPr>
-        <w:lastRenderedPageBreak/>
         <w:drawing>
           <wp:inline distT="0" distB="0" distL="0" distR="0" wp14:anchorId="5EB58E07" wp14:editId="1EB534C3">
             <wp:extent cx="6471285" cy="3364865"/>
@@ -23241,6 +23035,7 @@
         <w:rPr>
           <w:noProof/>
         </w:rPr>
+        <w:lastRenderedPageBreak/>
         <w:drawing>
           <wp:inline distT="0" distB="0" distL="0" distR="0" wp14:anchorId="4ED46761" wp14:editId="26B98D4F">
             <wp:extent cx="6471285" cy="3528060"/>
@@ -23302,7 +23097,6 @@
         <w:rPr>
           <w:noProof/>
         </w:rPr>
-        <w:lastRenderedPageBreak/>
         <w:drawing>
           <wp:inline distT="0" distB="0" distL="0" distR="0" wp14:anchorId="5BDC1273" wp14:editId="533B6B4C">
             <wp:extent cx="6471285" cy="1841500"/>
@@ -23440,6 +23234,7 @@
         <w:rPr>
           <w:noProof/>
         </w:rPr>
+        <w:lastRenderedPageBreak/>
         <w:drawing>
           <wp:inline distT="0" distB="0" distL="0" distR="0" wp14:anchorId="2561F7EB" wp14:editId="647DEA80">
             <wp:extent cx="5416952" cy="2953113"/>
@@ -23506,7 +23301,6 @@
         <w:rPr>
           <w:noProof/>
         </w:rPr>
-        <w:lastRenderedPageBreak/>
         <w:drawing>
           <wp:inline distT="0" distB="0" distL="0" distR="0" wp14:anchorId="5EA79232" wp14:editId="4F613ABA">
             <wp:extent cx="4127500" cy="2933700"/>
@@ -23588,6 +23382,7 @@
         <w:ind w:right="27"/>
       </w:pPr>
       <w:r>
+        <w:lastRenderedPageBreak/>
         <w:t xml:space="preserve">Robotic Arm Assembly and Control: Integrating the robotic arm presented mechanical and software challenges. We used the </w:t>
       </w:r>
       <w:proofErr w:type="spellStart"/>
@@ -23783,14 +23578,6 @@
           <w:sz w:val="18"/>
         </w:rPr>
         <w:br/>
-      </w:r>
-      <w:r>
-        <w:rPr>
-          <w:rStyle w:val="VerbatimChar"/>
-          <w:rFonts w:ascii="IBM Plex Mono" w:eastAsia="IBM Plex Mono" w:hAnsi="IBM Plex Mono" w:cs="IBM Plex Mono"/>
-          <w:sz w:val="18"/>
-        </w:rPr>
-        <w:lastRenderedPageBreak/>
         <w:t>Environment="PYTHONPATH=/opt/dofbot-venv/lib/python3.9/site-packages"</w:t>
       </w:r>
       <w:r>
@@ -24043,8 +23830,8 @@
         </w:rPr>
         <w:t>: 99.7% service uptime with automatic recovery from USB disconnects</w:t>
       </w:r>
-      <w:bookmarkStart w:id="6" w:name="fnref4"/>
-      <w:bookmarkEnd w:id="6"/>
+      <w:bookmarkStart w:id="7" w:name="fnref4"/>
+      <w:bookmarkEnd w:id="7"/>
       <w:r>
         <w:t xml:space="preserve"> </w:t>
       </w:r>
@@ -24147,10 +23934,10 @@
         </w:rPr>
         <w:t>: Concurrent servo actuation (12V/4A peak) and USB3 camera streaming caused brownout-induced resets</w:t>
       </w:r>
-      <w:bookmarkStart w:id="7" w:name="fnref3:1"/>
-      <w:bookmarkStart w:id="8" w:name="fnref5"/>
-      <w:bookmarkEnd w:id="7"/>
+      <w:bookmarkStart w:id="8" w:name="fnref3:1"/>
+      <w:bookmarkStart w:id="9" w:name="fnref5"/>
       <w:bookmarkEnd w:id="8"/>
+      <w:bookmarkEnd w:id="9"/>
       <w:r>
         <w:t>.</w:t>
       </w:r>
@@ -24281,6 +24068,14 @@
           <w:sz w:val="18"/>
         </w:rPr>
         <w:br/>
+      </w:r>
+      <w:r>
+        <w:rPr>
+          <w:rStyle w:val="VerbatimChar"/>
+          <w:rFonts w:ascii="IBM Plex Mono" w:eastAsia="IBM Plex Mono" w:hAnsi="IBM Plex Mono" w:cs="IBM Plex Mono"/>
+          <w:sz w:val="18"/>
+        </w:rPr>
+        <w:lastRenderedPageBreak/>
         <w:t xml:space="preserve">        </w:t>
       </w:r>
       <w:proofErr w:type="spellStart"/>
@@ -24429,8 +24224,8 @@
         </w:rPr>
         <w:t>Servos → Dedicated 12V/6A surge-protected rail</w:t>
       </w:r>
-      <w:bookmarkStart w:id="9" w:name="fnref6"/>
-      <w:bookmarkEnd w:id="9"/>
+      <w:bookmarkStart w:id="10" w:name="fnref6"/>
+      <w:bookmarkEnd w:id="10"/>
     </w:p>
     <w:p>
       <w:pPr>
@@ -24483,10 +24278,10 @@
         </w:rPr>
         <w:t>: Eliminated 98% of unexpected disconnects while maintaining 4.2 FPS inference</w:t>
       </w:r>
-      <w:bookmarkStart w:id="10" w:name="fnref4:1"/>
-      <w:bookmarkStart w:id="11" w:name="fnref5:1"/>
-      <w:bookmarkEnd w:id="10"/>
+      <w:bookmarkStart w:id="11" w:name="fnref4:1"/>
+      <w:bookmarkStart w:id="12" w:name="fnref5:1"/>
       <w:bookmarkEnd w:id="11"/>
+      <w:bookmarkEnd w:id="12"/>
       <w:r>
         <w:t xml:space="preserve"> </w:t>
       </w:r>
@@ -25329,10 +25124,10 @@
         </w:rPr>
         <w:t>: 8-bit model conversion during idle cycles</w:t>
       </w:r>
-      <w:bookmarkStart w:id="12" w:name="fnref7"/>
-      <w:bookmarkStart w:id="13" w:name="fnref8"/>
-      <w:bookmarkEnd w:id="12"/>
+      <w:bookmarkStart w:id="13" w:name="fnref7"/>
+      <w:bookmarkStart w:id="14" w:name="fnref8"/>
       <w:bookmarkEnd w:id="13"/>
+      <w:bookmarkEnd w:id="14"/>
       <w:r>
         <w:t xml:space="preserve"> </w:t>
       </w:r>
@@ -25358,10 +25153,10 @@
         </w:rPr>
         <w:t>: Dynamic resolution scaling (640x480 → 320x240) under thermal stress</w:t>
       </w:r>
-      <w:bookmarkStart w:id="14" w:name="fnref9"/>
-      <w:bookmarkStart w:id="15" w:name="fnref8:1"/>
-      <w:bookmarkEnd w:id="14"/>
+      <w:bookmarkStart w:id="15" w:name="fnref9"/>
+      <w:bookmarkStart w:id="16" w:name="fnref8:1"/>
       <w:bookmarkEnd w:id="15"/>
+      <w:bookmarkEnd w:id="16"/>
       <w:r>
         <w:t xml:space="preserve"> </w:t>
       </w:r>
@@ -25495,6 +25290,7 @@
           <w:rFonts w:ascii="IBM Plex Mono" w:eastAsia="IBM Plex Mono" w:hAnsi="IBM Plex Mono" w:cs="IBM Plex Mono"/>
           <w:sz w:val="18"/>
         </w:rPr>
+        <w:lastRenderedPageBreak/>
         <w:t xml:space="preserve"># Active cooling control in </w:t>
       </w:r>
       <w:r>
@@ -25784,10 +25580,10 @@
         </w:rPr>
         <w:t>: Sustained 45-55°C under load while maintaining 85% relative performance</w:t>
       </w:r>
-      <w:bookmarkStart w:id="16" w:name="fnref9:1"/>
-      <w:bookmarkStart w:id="17" w:name="fnref10:1"/>
-      <w:bookmarkEnd w:id="16"/>
+      <w:bookmarkStart w:id="17" w:name="fnref9:1"/>
+      <w:bookmarkStart w:id="18" w:name="fnref10:1"/>
       <w:bookmarkEnd w:id="17"/>
+      <w:bookmarkEnd w:id="18"/>
       <w:r>
         <w:t xml:space="preserve"> </w:t>
       </w:r>
@@ -25863,6 +25659,7 @@
     <w:p>
       <w:pPr>
         <w:pStyle w:val="Heading1"/>
+        <w:shd w:val="clear" w:color="auto" w:fill="84E290" w:themeFill="accent3" w:themeFillTint="66"/>
         <w:ind w:left="-5"/>
       </w:pPr>
       <w:r>
@@ -25871,6 +25668,7 @@
     </w:p>
     <w:p>
       <w:pPr>
+        <w:shd w:val="clear" w:color="auto" w:fill="84E290" w:themeFill="accent3" w:themeFillTint="66"/>
         <w:spacing w:after="261"/>
         <w:ind w:right="27"/>
       </w:pPr>
@@ -25881,6 +25679,7 @@
     <w:p>
       <w:pPr>
         <w:pStyle w:val="Heading2"/>
+        <w:shd w:val="clear" w:color="auto" w:fill="84E290" w:themeFill="accent3" w:themeFillTint="66"/>
         <w:ind w:left="-5"/>
       </w:pPr>
       <w:r>
@@ -25889,6 +25688,7 @@
     </w:p>
     <w:p>
       <w:pPr>
+        <w:shd w:val="clear" w:color="auto" w:fill="84E290" w:themeFill="accent3" w:themeFillTint="66"/>
         <w:ind w:left="475" w:right="27"/>
       </w:pPr>
       <w:r>
@@ -26326,6 +26126,7 @@
     </w:p>
     <w:p>
       <w:pPr>
+        <w:shd w:val="clear" w:color="auto" w:fill="84E290" w:themeFill="accent3" w:themeFillTint="66"/>
         <w:ind w:left="475" w:right="27"/>
       </w:pPr>
       <w:r>
@@ -26334,6 +26135,7 @@
     </w:p>
     <w:p>
       <w:pPr>
+        <w:shd w:val="clear" w:color="auto" w:fill="84E290" w:themeFill="accent3" w:themeFillTint="66"/>
         <w:spacing w:after="261"/>
         <w:ind w:left="475" w:right="27"/>
       </w:pPr>
@@ -26344,15 +26146,16 @@
     <w:p>
       <w:pPr>
         <w:pStyle w:val="Heading2"/>
+        <w:shd w:val="clear" w:color="auto" w:fill="84E290" w:themeFill="accent3" w:themeFillTint="66"/>
         <w:ind w:left="-5"/>
       </w:pPr>
       <w:r>
-        <w:lastRenderedPageBreak/>
         <w:t>Healthcare Applications</w:t>
       </w:r>
     </w:p>
     <w:p>
       <w:pPr>
+        <w:shd w:val="clear" w:color="auto" w:fill="84E290" w:themeFill="accent3" w:themeFillTint="66"/>
         <w:ind w:left="475" w:right="27"/>
       </w:pPr>
       <w:r>
@@ -26663,6 +26466,7 @@
     </w:p>
     <w:p>
       <w:pPr>
+        <w:shd w:val="clear" w:color="auto" w:fill="84E290" w:themeFill="accent3" w:themeFillTint="66"/>
         <w:spacing w:after="276"/>
         <w:ind w:left="475" w:right="27"/>
       </w:pPr>
@@ -26673,6 +26477,7 @@
     <w:p>
       <w:pPr>
         <w:pStyle w:val="Heading2"/>
+        <w:shd w:val="clear" w:color="auto" w:fill="84E290" w:themeFill="accent3" w:themeFillTint="66"/>
         <w:ind w:left="-5"/>
       </w:pPr>
       <w:r>
@@ -26681,6 +26486,7 @@
     </w:p>
     <w:p>
       <w:pPr>
+        <w:shd w:val="clear" w:color="auto" w:fill="84E290" w:themeFill="accent3" w:themeFillTint="66"/>
         <w:ind w:left="475" w:right="27"/>
       </w:pPr>
       <w:r>
@@ -27118,6 +26924,7 @@
     </w:p>
     <w:p>
       <w:pPr>
+        <w:shd w:val="clear" w:color="auto" w:fill="84E290" w:themeFill="accent3" w:themeFillTint="66"/>
         <w:ind w:left="475" w:right="27"/>
       </w:pPr>
       <w:r>
@@ -27126,6 +26933,7 @@
     </w:p>
     <w:p>
       <w:pPr>
+        <w:shd w:val="clear" w:color="auto" w:fill="84E290" w:themeFill="accent3" w:themeFillTint="66"/>
         <w:spacing w:line="403" w:lineRule="auto"/>
         <w:ind w:left="0" w:right="866" w:firstLine="164"/>
       </w:pPr>
@@ -27142,6 +26950,7 @@
     <w:p>
       <w:pPr>
         <w:pStyle w:val="Heading2"/>
+        <w:shd w:val="clear" w:color="auto" w:fill="84E290" w:themeFill="accent3" w:themeFillTint="66"/>
         <w:ind w:left="-5"/>
       </w:pPr>
       <w:r>
@@ -27150,6 +26959,7 @@
     </w:p>
     <w:p>
       <w:pPr>
+        <w:shd w:val="clear" w:color="auto" w:fill="84E290" w:themeFill="accent3" w:themeFillTint="66"/>
         <w:spacing w:after="267"/>
         <w:ind w:right="27"/>
       </w:pPr>
@@ -27176,6 +26986,7 @@
     <w:p>
       <w:pPr>
         <w:pStyle w:val="Heading2"/>
+        <w:shd w:val="clear" w:color="auto" w:fill="84E290" w:themeFill="accent3" w:themeFillTint="66"/>
         <w:ind w:left="-5"/>
       </w:pPr>
       <w:r>
@@ -27184,6 +26995,7 @@
     </w:p>
     <w:p>
       <w:pPr>
+        <w:shd w:val="clear" w:color="auto" w:fill="84E290" w:themeFill="accent3" w:themeFillTint="66"/>
         <w:spacing w:after="305"/>
         <w:ind w:right="27"/>
       </w:pPr>
@@ -27194,14 +27006,17 @@
     <w:p>
       <w:pPr>
         <w:pStyle w:val="Heading2"/>
+        <w:shd w:val="clear" w:color="auto" w:fill="84E290" w:themeFill="accent3" w:themeFillTint="66"/>
         <w:ind w:left="-5"/>
       </w:pPr>
       <w:r>
+        <w:lastRenderedPageBreak/>
         <w:t>Technology Literacy Impact</w:t>
       </w:r>
     </w:p>
     <w:p>
       <w:pPr>
+        <w:shd w:val="clear" w:color="auto" w:fill="84E290" w:themeFill="accent3" w:themeFillTint="66"/>
         <w:spacing w:after="297"/>
         <w:ind w:right="27"/>
       </w:pPr>
@@ -27212,6 +27027,7 @@
     <w:p>
       <w:pPr>
         <w:pStyle w:val="Heading1"/>
+        <w:shd w:val="clear" w:color="auto" w:fill="84E290" w:themeFill="accent3" w:themeFillTint="66"/>
         <w:ind w:left="-5"/>
       </w:pPr>
       <w:r>
@@ -27221,6 +27037,7 @@
     <w:p>
       <w:pPr>
         <w:pStyle w:val="Heading2"/>
+        <w:shd w:val="clear" w:color="auto" w:fill="84E290" w:themeFill="accent3" w:themeFillTint="66"/>
         <w:ind w:left="-5"/>
       </w:pPr>
       <w:r>
@@ -27229,6 +27046,7 @@
     </w:p>
     <w:p>
       <w:pPr>
+        <w:shd w:val="clear" w:color="auto" w:fill="84E290" w:themeFill="accent3" w:themeFillTint="66"/>
         <w:spacing w:after="252"/>
         <w:ind w:right="27"/>
       </w:pPr>
@@ -27239,6 +27057,7 @@
     <w:p>
       <w:pPr>
         <w:pStyle w:val="Heading2"/>
+        <w:shd w:val="clear" w:color="auto" w:fill="84E290" w:themeFill="accent3" w:themeFillTint="66"/>
         <w:ind w:left="-5"/>
       </w:pPr>
       <w:r>
@@ -27247,6 +27066,7 @@
     </w:p>
     <w:p>
       <w:pPr>
+        <w:shd w:val="clear" w:color="auto" w:fill="84E290" w:themeFill="accent3" w:themeFillTint="66"/>
         <w:spacing w:after="252"/>
         <w:ind w:right="27"/>
       </w:pPr>
@@ -27265,6 +27085,7 @@
     <w:p>
       <w:pPr>
         <w:pStyle w:val="Heading2"/>
+        <w:shd w:val="clear" w:color="auto" w:fill="84E290" w:themeFill="accent3" w:themeFillTint="66"/>
         <w:ind w:left="-5"/>
       </w:pPr>
       <w:r>
@@ -27273,6 +27094,7 @@
     </w:p>
     <w:p>
       <w:pPr>
+        <w:shd w:val="clear" w:color="auto" w:fill="84E290" w:themeFill="accent3" w:themeFillTint="66"/>
         <w:spacing w:after="267"/>
         <w:ind w:right="27"/>
       </w:pPr>
@@ -27283,15 +27105,16 @@
     <w:p>
       <w:pPr>
         <w:pStyle w:val="Heading2"/>
+        <w:shd w:val="clear" w:color="auto" w:fill="84E290" w:themeFill="accent3" w:themeFillTint="66"/>
         <w:ind w:left="-5"/>
       </w:pPr>
       <w:r>
-        <w:lastRenderedPageBreak/>
         <w:t>Integration with Learning Management Systems</w:t>
       </w:r>
     </w:p>
     <w:p>
       <w:pPr>
+        <w:shd w:val="clear" w:color="auto" w:fill="84E290" w:themeFill="accent3" w:themeFillTint="66"/>
         <w:spacing w:after="267"/>
         <w:ind w:right="27"/>
       </w:pPr>
@@ -27302,6 +27125,7 @@
     <w:p>
       <w:pPr>
         <w:pStyle w:val="Heading2"/>
+        <w:shd w:val="clear" w:color="auto" w:fill="84E290" w:themeFill="accent3" w:themeFillTint="66"/>
         <w:ind w:left="-5"/>
       </w:pPr>
       <w:r>
@@ -27310,6 +27134,7 @@
     </w:p>
     <w:p>
       <w:pPr>
+        <w:shd w:val="clear" w:color="auto" w:fill="84E290" w:themeFill="accent3" w:themeFillTint="66"/>
         <w:spacing w:after="85" w:line="389" w:lineRule="auto"/>
         <w:ind w:left="8" w:right="422"/>
       </w:pPr>
@@ -27325,6 +27150,7 @@
     </w:p>
     <w:p>
       <w:pPr>
+        <w:shd w:val="clear" w:color="auto" w:fill="84E290" w:themeFill="accent3" w:themeFillTint="66"/>
         <w:spacing w:after="216"/>
         <w:ind w:right="27"/>
       </w:pPr>
@@ -27334,6 +27160,7 @@
     </w:p>
     <w:p>
       <w:pPr>
+        <w:shd w:val="clear" w:color="auto" w:fill="84E290" w:themeFill="accent3" w:themeFillTint="66"/>
         <w:ind w:left="475" w:right="27"/>
       </w:pPr>
       <w:r>
@@ -27898,6 +27725,7 @@
     </w:p>
     <w:p>
       <w:pPr>
+        <w:shd w:val="clear" w:color="auto" w:fill="84E290" w:themeFill="accent3" w:themeFillTint="66"/>
         <w:ind w:left="475" w:right="27"/>
       </w:pPr>
       <w:r>
@@ -27906,6 +27734,7 @@
     </w:p>
     <w:p>
       <w:pPr>
+        <w:shd w:val="clear" w:color="auto" w:fill="84E290" w:themeFill="accent3" w:themeFillTint="66"/>
         <w:ind w:left="475" w:right="27"/>
       </w:pPr>
       <w:r>
@@ -27914,6 +27743,7 @@
     </w:p>
     <w:p>
       <w:pPr>
+        <w:shd w:val="clear" w:color="auto" w:fill="84E290" w:themeFill="accent3" w:themeFillTint="66"/>
         <w:spacing w:after="216"/>
         <w:ind w:left="475" w:right="27"/>
       </w:pPr>
@@ -27923,6 +27753,7 @@
     </w:p>
     <w:p>
       <w:pPr>
+        <w:shd w:val="clear" w:color="auto" w:fill="84E290" w:themeFill="accent3" w:themeFillTint="66"/>
         <w:ind w:right="27"/>
       </w:pPr>
       <w:r>
@@ -27966,7 +27797,7 @@
     <w:p/>
     <w:p/>
   </w:comment>
-  <w:comment w:id="1" w:author="Garza-Robledo Miguel A" w:date="2025-05-11T00:32:00Z" w:initials="m">
+  <w:comment w:id="1" w:author="mikey" w:date="2025-05-11T18:58:00Z" w:initials="m">
     <w:p>
       <w:r>
         <w:rPr>
@@ -27979,12 +27810,29 @@
           <w:sz w:val="20"/>
           <w:szCs w:val="20"/>
         </w:rPr>
+        <w:t>add better introduction</w:t>
+      </w:r>
+    </w:p>
+  </w:comment>
+  <w:comment w:id="2" w:author="Garza-Robledo Miguel A" w:date="2025-05-11T00:32:00Z" w:initials="m">
+    <w:p>
+      <w:r>
+        <w:rPr>
+          <w:rStyle w:val="CommentReference"/>
+        </w:rPr>
+        <w:annotationRef/>
+      </w:r>
+      <w:r>
+        <w:rPr>
+          <w:sz w:val="20"/>
+          <w:szCs w:val="20"/>
+        </w:rPr>
         <w:t>fix</w:t>
       </w:r>
     </w:p>
     <w:p/>
   </w:comment>
-  <w:comment w:id="2" w:author="mikey" w:date="2025-05-11T10:40:00Z" w:initials="m">
+  <w:comment w:id="3" w:author="mikey" w:date="2025-05-11T10:40:00Z" w:initials="m">
     <w:p>
       <w:r>
         <w:rPr>
@@ -28017,6 +27865,7 @@
 <file path=word/commentsExtended.xml><?xml version="1.0" encoding="utf-8"?>
 <w15:commentsEx xmlns:wpc="http://schemas.microsoft.com/office/word/2010/wordprocessingCanvas" xmlns:cx="http://schemas.microsoft.com/office/drawing/2014/chartex" xmlns:cx1="http://schemas.microsoft.com/office/drawing/2015/9/8/chartex" xmlns:cx2="http://schemas.microsoft.com/office/drawing/2015/10/21/chartex" xmlns:cx3="http://schemas.microsoft.com/office/drawing/2016/5/9/chartex" xmlns:cx4="http://schemas.microsoft.com/office/drawing/2016/5/10/chartex" xmlns:cx5="http://schemas.microsoft.com/office/drawing/2016/5/11/chartex" xmlns:cx6="http://schemas.microsoft.com/office/drawing/2016/5/12/chartex" xmlns:cx7="http://schemas.microsoft.com/office/drawing/2016/5/13/chartex" xmlns:cx8="http://schemas.microsoft.com/office/drawing/2016/5/14/chartex" xmlns:mc="http://schemas.openxmlformats.org/markup-compatibility/2006" xmlns:aink="http://schemas.microsoft.com/office/drawing/2016/ink" xmlns:am3d="http://schemas.microsoft.com/office/drawing/2017/model3d" xmlns:o="urn:schemas-microsoft-com:office:office" xmlns:oel="http://schemas.microsoft.com/office/2019/extlst" xmlns:r="http://schemas.openxmlformats.org/officeDocument/2006/relationships" xmlns:m="http://schemas.openxmlformats.org/officeDocument/2006/math" xmlns:v="urn:schemas-microsoft-com:vml" xmlns:wp14="http://schemas.microsoft.com/office/word/2010/wordprocessingDrawing" xmlns:wp="http://schemas.openxmlformats.org/drawingml/2006/wordprocessingDrawing" xmlns:w10="urn:schemas-microsoft-com:office:word" xmlns:w="http://schemas.openxmlformats.org/wordprocessingml/2006/main" xmlns:w14="http://schemas.microsoft.com/office/word/2010/wordml" xmlns:w15="http://schemas.microsoft.com/office/word/2012/wordml" xmlns:w16cex="http://schemas.microsoft.com/office/word/2018/wordml/cex" xmlns:w16cid="http://schemas.microsoft.com/office/word/2016/wordml/cid" xmlns:w16="http://schemas.microsoft.com/office/word/2018/wordml" xmlns:w16du="http://schemas.microsoft.com/office/word/2023/wordml/word16du" xmlns:w16sdtdh="http://schemas.microsoft.com/office/word/2020/wordml/sdtdatahash" xmlns:w16sdtfl="http://schemas.microsoft.com/office/word/2024/wordml/sdtformatlock" xmlns:w16se="http://schemas.microsoft.com/office/word/2015/wordml/symex" xmlns:wpg="http://schemas.microsoft.com/office/word/2010/wordprocessingGroup" xmlns:wpi="http://schemas.microsoft.com/office/word/2010/wordprocessingInk" xmlns:wne="http://schemas.microsoft.com/office/word/2006/wordml" xmlns:wps="http://schemas.microsoft.com/office/word/2010/wordprocessingShape" mc:Ignorable="w14 w15 w16se w16cid w16 w16cex w16sdtdh w16sdtfl w16du wp14">
   <w15:commentEx w15:paraId="73411346" w15:done="0"/>
+  <w15:commentEx w15:paraId="2557CD67" w15:paraIdParent="73411346" w15:done="0"/>
   <w15:commentEx w15:paraId="15D30F6A" w15:done="0"/>
   <w15:commentEx w15:paraId="7BC53A79" w15:done="0"/>
 </w15:commentsEx>
@@ -28025,6 +27874,7 @@
 <file path=word/commentsExtensible.xml><?xml version="1.0" encoding="utf-8"?>
 <w16cex:commentsExtensible xmlns:wpc="http://schemas.microsoft.com/office/word/2010/wordprocessingCanvas" xmlns:cx="http://schemas.microsoft.com/office/drawing/2014/chartex" xmlns:cx1="http://schemas.microsoft.com/office/drawing/2015/9/8/chartex" xmlns:cx2="http://schemas.microsoft.com/office/drawing/2015/10/21/chartex" xmlns:cx3="http://schemas.microsoft.com/office/drawing/2016/5/9/chartex" xmlns:cx4="http://schemas.microsoft.com/office/drawing/2016/5/10/chartex" xmlns:cx5="http://schemas.microsoft.com/office/drawing/2016/5/11/chartex" xmlns:cx6="http://schemas.microsoft.com/office/drawing/2016/5/12/chartex" xmlns:cx7="http://schemas.microsoft.com/office/drawing/2016/5/13/chartex" xmlns:cx8="http://schemas.microsoft.com/office/drawing/2016/5/14/chartex" xmlns:cr="http://schemas.microsoft.com/office/comments/2020/reactions" xmlns:mc="http://schemas.openxmlformats.org/markup-compatibility/2006" xmlns:aink="http://schemas.microsoft.com/office/drawing/2016/ink" xmlns:am3d="http://schemas.microsoft.com/office/drawing/2017/model3d" xmlns:o="urn:schemas-microsoft-com:office:office" xmlns:oel="http://schemas.microsoft.com/office/2019/extlst" xmlns:r="http://schemas.openxmlformats.org/officeDocument/2006/relationships" xmlns:m="http://schemas.openxmlformats.org/officeDocument/2006/math" xmlns:v="urn:schemas-microsoft-com:vml" xmlns:wp14="http://schemas.microsoft.com/office/word/2010/wordprocessingDrawing" xmlns:wp="http://schemas.openxmlformats.org/drawingml/2006/wordprocessingDrawing" xmlns:w10="urn:schemas-microsoft-com:office:word" xmlns:w="http://schemas.openxmlformats.org/wordprocessingml/2006/main" xmlns:w14="http://schemas.microsoft.com/office/word/2010/wordml" xmlns:w15="http://schemas.microsoft.com/office/word/2012/wordml" xmlns:w16cex="http://schemas.microsoft.com/office/word/2018/wordml/cex" xmlns:w16cid="http://schemas.microsoft.com/office/word/2016/wordml/cid" xmlns:w16="http://schemas.microsoft.com/office/word/2018/wordml" xmlns:w16du="http://schemas.microsoft.com/office/word/2023/wordml/word16du" xmlns:w16sdtdh="http://schemas.microsoft.com/office/word/2020/wordml/sdtdatahash" xmlns:w16sdtfl="http://schemas.microsoft.com/office/word/2024/wordml/sdtformatlock" xmlns:w16se="http://schemas.microsoft.com/office/word/2015/wordml/symex" xmlns:wpg="http://schemas.microsoft.com/office/word/2010/wordprocessingGroup" xmlns:wpi="http://schemas.microsoft.com/office/word/2010/wordprocessingInk" xmlns:wne="http://schemas.microsoft.com/office/word/2006/wordml" xmlns:wps="http://schemas.microsoft.com/office/word/2010/wordprocessingShape" mc:Ignorable="w14 w15 w16se w16cid w16 w16cex w16sdtdh w16sdtfl cr w16du wp14">
   <w16cex:commentExtensible w16cex:durableId="76E16994" w16cex:dateUtc="2025-05-11T14:48:00Z"/>
+  <w16cex:commentExtensible w16cex:durableId="2A664BB6" w16cex:dateUtc="2025-05-11T23:58:00Z"/>
   <w16cex:commentExtensible w16cex:durableId="3EB14B9C" w16cex:dateUtc="2025-05-11T05:32:00Z"/>
   <w16cex:commentExtensible w16cex:durableId="13CBBB06" w16cex:dateUtc="2025-05-11T15:40:00Z"/>
 </w16cex:commentsExtensible>
@@ -28033,6 +27883,7 @@
 <file path=word/commentsIds.xml><?xml version="1.0" encoding="utf-8"?>
 <w16cid:commentsIds xmlns:wpc="http://schemas.microsoft.com/office/word/2010/wordprocessingCanvas" xmlns:cx="http://schemas.microsoft.com/office/drawing/2014/chartex" xmlns:cx1="http://schemas.microsoft.com/office/drawing/2015/9/8/chartex" xmlns:cx2="http://schemas.microsoft.com/office/drawing/2015/10/21/chartex" xmlns:cx3="http://schemas.microsoft.com/office/drawing/2016/5/9/chartex" xmlns:cx4="http://schemas.microsoft.com/office/drawing/2016/5/10/chartex" xmlns:cx5="http://schemas.microsoft.com/office/drawing/2016/5/11/chartex" xmlns:cx6="http://schemas.microsoft.com/office/drawing/2016/5/12/chartex" xmlns:cx7="http://schemas.microsoft.com/office/drawing/2016/5/13/chartex" xmlns:cx8="http://schemas.microsoft.com/office/drawing/2016/5/14/chartex" xmlns:mc="http://schemas.openxmlformats.org/markup-compatibility/2006" xmlns:aink="http://schemas.microsoft.com/office/drawing/2016/ink" xmlns:am3d="http://schemas.microsoft.com/office/drawing/2017/model3d" xmlns:o="urn:schemas-microsoft-com:office:office" xmlns:oel="http://schemas.microsoft.com/office/2019/extlst" xmlns:r="http://schemas.openxmlformats.org/officeDocument/2006/relationships" xmlns:m="http://schemas.openxmlformats.org/officeDocument/2006/math" xmlns:v="urn:schemas-microsoft-com:vml" xmlns:wp14="http://schemas.microsoft.com/office/word/2010/wordprocessingDrawing" xmlns:wp="http://schemas.openxmlformats.org/drawingml/2006/wordprocessingDrawing" xmlns:w10="urn:schemas-microsoft-com:office:word" xmlns:w="http://schemas.openxmlformats.org/wordprocessingml/2006/main" xmlns:w14="http://schemas.microsoft.com/office/word/2010/wordml" xmlns:w15="http://schemas.microsoft.com/office/word/2012/wordml" xmlns:w16cex="http://schemas.microsoft.com/office/word/2018/wordml/cex" xmlns:w16cid="http://schemas.microsoft.com/office/word/2016/wordml/cid" xmlns:w16="http://schemas.microsoft.com/office/word/2018/wordml" xmlns:w16du="http://schemas.microsoft.com/office/word/2023/wordml/word16du" xmlns:w16sdtdh="http://schemas.microsoft.com/office/word/2020/wordml/sdtdatahash" xmlns:w16sdtfl="http://schemas.microsoft.com/office/word/2024/wordml/sdtformatlock" xmlns:w16se="http://schemas.microsoft.com/office/word/2015/wordml/symex" xmlns:wpg="http://schemas.microsoft.com/office/word/2010/wordprocessingGroup" xmlns:wpi="http://schemas.microsoft.com/office/word/2010/wordprocessingInk" xmlns:wne="http://schemas.microsoft.com/office/word/2006/wordml" xmlns:wps="http://schemas.microsoft.com/office/word/2010/wordprocessingShape" mc:Ignorable="w14 w15 w16se w16cid w16 w16cex w16sdtdh w16sdtfl w16du wp14">
   <w16cid:commentId w16cid:paraId="73411346" w16cid:durableId="76E16994"/>
+  <w16cid:commentId w16cid:paraId="2557CD67" w16cid:durableId="2A664BB6"/>
   <w16cid:commentId w16cid:paraId="15D30F6A" w16cid:durableId="3EB14B9C"/>
   <w16cid:commentId w16cid:paraId="7BC53A79" w16cid:durableId="13CBBB06"/>
 </w16cid:commentsIds>
@@ -28255,27 +28106,20 @@
 <w:hdr xmlns:wpc="http://schemas.microsoft.com/office/word/2010/wordprocessingCanvas" xmlns:cx="http://schemas.microsoft.com/office/drawing/2014/chartex" xmlns:cx1="http://schemas.microsoft.com/office/drawing/2015/9/8/chartex" xmlns:cx2="http://schemas.microsoft.com/office/drawing/2015/10/21/chartex" xmlns:cx3="http://schemas.microsoft.com/office/drawing/2016/5/9/chartex" xmlns:cx4="http://schemas.microsoft.com/office/drawing/2016/5/10/chartex" xmlns:cx5="http://schemas.microsoft.com/office/drawing/2016/5/11/chartex" xmlns:cx6="http://schemas.microsoft.com/office/drawing/2016/5/12/chartex" xmlns:cx7="http://schemas.microsoft.com/office/drawing/2016/5/13/chartex" xmlns:cx8="http://schemas.microsoft.com/office/drawing/2016/5/14/chartex" xmlns:mc="http://schemas.openxmlformats.org/markup-compatibility/2006" xmlns:aink="http://schemas.microsoft.com/office/drawing/2016/ink" xmlns:am3d="http://schemas.microsoft.com/office/drawing/2017/model3d" xmlns:o="urn:schemas-microsoft-com:office:office" xmlns:oel="http://schemas.microsoft.com/office/2019/extlst" xmlns:r="http://schemas.openxmlformats.org/officeDocument/2006/relationships" xmlns:m="http://schemas.openxmlformats.org/officeDocument/2006/math" xmlns:v="urn:schemas-microsoft-com:vml" xmlns:wp14="http://schemas.microsoft.com/office/word/2010/wordprocessingDrawing" xmlns:wp="http://schemas.openxmlformats.org/drawingml/2006/wordprocessingDrawing" xmlns:w10="urn:schemas-microsoft-com:office:word" xmlns:w="http://schemas.openxmlformats.org/wordprocessingml/2006/main" xmlns:w14="http://schemas.microsoft.com/office/word/2010/wordml" xmlns:w15="http://schemas.microsoft.com/office/word/2012/wordml" xmlns:w16cex="http://schemas.microsoft.com/office/word/2018/wordml/cex" xmlns:w16cid="http://schemas.microsoft.com/office/word/2016/wordml/cid" xmlns:w16="http://schemas.microsoft.com/office/word/2018/wordml" xmlns:w16du="http://schemas.microsoft.com/office/word/2023/wordml/word16du" xmlns:w16sdtdh="http://schemas.microsoft.com/office/word/2020/wordml/sdtdatahash" xmlns:w16sdtfl="http://schemas.microsoft.com/office/word/2024/wordml/sdtformatlock" xmlns:w16se="http://schemas.microsoft.com/office/word/2015/wordml/symex" xmlns:wpg="http://schemas.microsoft.com/office/word/2010/wordprocessingGroup" xmlns:wpi="http://schemas.microsoft.com/office/word/2010/wordprocessingInk" xmlns:wne="http://schemas.microsoft.com/office/word/2006/wordml" xmlns:wps="http://schemas.microsoft.com/office/word/2010/wordprocessingShape" mc:Ignorable="w14 w15 w16se w16cid w16 w16cex w16sdtdh w16sdtfl w16du wp14">
   <w:p>
     <w:pPr>
+      <w:pStyle w:val="Header"/>
+    </w:pPr>
+    <w:r>
+      <w:t>Project Report</w:t>
+    </w:r>
+  </w:p>
+  <w:p>
+    <w:pPr>
       <w:tabs>
         <w:tab w:val="right" w:pos="10191"/>
       </w:tabs>
       <w:spacing w:after="0" w:line="259" w:lineRule="auto"/>
       <w:ind w:left="-102" w:right="-96" w:firstLine="0"/>
     </w:pPr>
-    <w:r>
-      <w:rPr>
-        <w:rFonts w:ascii="Times New Roman" w:eastAsia="Times New Roman" w:hAnsi="Times New Roman" w:cs="Times New Roman"/>
-        <w:sz w:val="18"/>
-      </w:rPr>
-      <w:t>POC.md</w:t>
-    </w:r>
-    <w:r>
-      <w:rPr>
-        <w:rFonts w:ascii="Times New Roman" w:eastAsia="Times New Roman" w:hAnsi="Times New Roman" w:cs="Times New Roman"/>
-        <w:sz w:val="18"/>
-      </w:rPr>
-      <w:tab/>
-      <w:t>2025-05-08</w:t>
-    </w:r>
   </w:p>
 </w:hdr>
 </file>
@@ -28285,10 +28129,20 @@
   <w:sdt>
     <w:sdtPr>
       <w:rPr>
-        <w:color w:val="156082" w:themeColor="accent1"/>
+        <w:color w:val="000000" w:themeColor="text1"/>
         <w:sz w:val="20"/>
         <w:szCs w:val="20"/>
         <w:lang w:val="es-419"/>
+        <w14:shadow w14:blurRad="38100" w14:dist="19050" w14:dir="2700000" w14:sx="100000" w14:sy="100000" w14:kx="0" w14:ky="0" w14:algn="tl">
+          <w14:schemeClr w14:val="dk1">
+            <w14:alpha w14:val="60000"/>
+          </w14:schemeClr>
+        </w14:shadow>
+        <w14:textOutline w14:w="0" w14:cap="flat" w14:cmpd="sng" w14:algn="ctr">
+          <w14:noFill/>
+          <w14:prstDash w14:val="solid"/>
+          <w14:round/>
+        </w14:textOutline>
       </w:rPr>
       <w:alias w:val="Author"/>
       <w:tag w:val=""/>
@@ -28305,17 +28159,37 @@
           <w:pStyle w:val="Header"/>
           <w:jc w:val="center"/>
           <w:rPr>
-            <w:color w:val="156082" w:themeColor="accent1"/>
+            <w:color w:val="000000" w:themeColor="text1"/>
             <w:sz w:val="20"/>
             <w:lang w:val="es-419"/>
+            <w14:shadow w14:blurRad="38100" w14:dist="19050" w14:dir="2700000" w14:sx="100000" w14:sy="100000" w14:kx="0" w14:ky="0" w14:algn="tl">
+              <w14:schemeClr w14:val="dk1">
+                <w14:alpha w14:val="60000"/>
+              </w14:schemeClr>
+            </w14:shadow>
+            <w14:textOutline w14:w="0" w14:cap="flat" w14:cmpd="sng" w14:algn="ctr">
+              <w14:noFill/>
+              <w14:prstDash w14:val="solid"/>
+              <w14:round/>
+            </w14:textOutline>
           </w:rPr>
         </w:pPr>
         <w:r>
           <w:rPr>
-            <w:color w:val="156082" w:themeColor="accent1"/>
+            <w:color w:val="000000" w:themeColor="text1"/>
             <w:sz w:val="20"/>
             <w:szCs w:val="20"/>
             <w:lang w:val="es-419"/>
+            <w14:shadow w14:blurRad="38100" w14:dist="19050" w14:dir="2700000" w14:sx="100000" w14:sy="100000" w14:kx="0" w14:ky="0" w14:algn="tl">
+              <w14:schemeClr w14:val="dk1">
+                <w14:alpha w14:val="60000"/>
+              </w14:schemeClr>
+            </w14:shadow>
+            <w14:textOutline w14:w="0" w14:cap="flat" w14:cmpd="sng" w14:algn="ctr">
+              <w14:noFill/>
+              <w14:prstDash w14:val="solid"/>
+              <w14:round/>
+            </w14:textOutline>
           </w:rPr>
           <w:t>Garza-Robledo Miguel A</w:t>
         </w:r>
@@ -28327,24 +28201,51 @@
       <w:pStyle w:val="Header"/>
       <w:jc w:val="center"/>
       <w:rPr>
-        <w:caps/>
-        <w:color w:val="156082" w:themeColor="accent1"/>
+        <w:color w:val="000000" w:themeColor="text1"/>
         <w:lang w:val="es-419"/>
+        <w14:shadow w14:blurRad="38100" w14:dist="19050" w14:dir="2700000" w14:sx="100000" w14:sy="100000" w14:kx="0" w14:ky="0" w14:algn="tl">
+          <w14:schemeClr w14:val="dk1">
+            <w14:alpha w14:val="60000"/>
+          </w14:schemeClr>
+        </w14:shadow>
+        <w14:textOutline w14:w="0" w14:cap="flat" w14:cmpd="sng" w14:algn="ctr">
+          <w14:noFill/>
+          <w14:prstDash w14:val="solid"/>
+          <w14:round/>
+        </w14:textOutline>
       </w:rPr>
     </w:pPr>
     <w:r>
       <w:rPr>
-        <w:caps/>
-        <w:color w:val="156082" w:themeColor="accent1"/>
+        <w:color w:val="000000" w:themeColor="text1"/>
         <w:lang w:val="es-419"/>
+        <w14:shadow w14:blurRad="38100" w14:dist="19050" w14:dir="2700000" w14:sx="100000" w14:sy="100000" w14:kx="0" w14:ky="0" w14:algn="tl">
+          <w14:schemeClr w14:val="dk1">
+            <w14:alpha w14:val="60000"/>
+          </w14:schemeClr>
+        </w14:shadow>
+        <w14:textOutline w14:w="0" w14:cap="flat" w14:cmpd="sng" w14:algn="ctr">
+          <w14:noFill/>
+          <w14:prstDash w14:val="solid"/>
+          <w14:round/>
+        </w14:textOutline>
       </w:rPr>
       <w:t xml:space="preserve"> </w:t>
     </w:r>
     <w:sdt>
       <w:sdtPr>
         <w:rPr>
-          <w:caps/>
-          <w:color w:val="156082" w:themeColor="accent1"/>
+          <w:color w:val="000000" w:themeColor="text1"/>
+          <w14:shadow w14:blurRad="38100" w14:dist="19050" w14:dir="2700000" w14:sx="100000" w14:sy="100000" w14:kx="0" w14:ky="0" w14:algn="tl">
+            <w14:schemeClr w14:val="dk1">
+              <w14:alpha w14:val="60000"/>
+            </w14:schemeClr>
+          </w14:shadow>
+          <w14:textOutline w14:w="0" w14:cap="flat" w14:cmpd="sng" w14:algn="ctr">
+            <w14:noFill/>
+            <w14:prstDash w14:val="solid"/>
+            <w14:round/>
+          </w14:textOutline>
         </w:rPr>
         <w:alias w:val="Title"/>
         <w:tag w:val=""/>
@@ -28358,29 +28259,65 @@
       <w:sdtContent>
         <w:r>
           <w:rPr>
-            <w:caps/>
-            <w:color w:val="156082" w:themeColor="accent1"/>
+            <w:color w:val="000000" w:themeColor="text1"/>
+            <w14:shadow w14:blurRad="38100" w14:dist="19050" w14:dir="2700000" w14:sx="100000" w14:sy="100000" w14:kx="0" w14:ky="0" w14:algn="tl">
+              <w14:schemeClr w14:val="dk1">
+                <w14:alpha w14:val="60000"/>
+              </w14:schemeClr>
+            </w14:shadow>
+            <w14:textOutline w14:w="0" w14:cap="flat" w14:cmpd="sng" w14:algn="ctr">
+              <w14:noFill/>
+              <w14:prstDash w14:val="solid"/>
+              <w14:round/>
+            </w14:textOutline>
           </w:rPr>
           <w:fldChar w:fldCharType="begin"/>
         </w:r>
         <w:r>
           <w:rPr>
-            <w:caps/>
-            <w:color w:val="156082" w:themeColor="accent1"/>
+            <w:color w:val="000000" w:themeColor="text1"/>
+            <w14:shadow w14:blurRad="38100" w14:dist="19050" w14:dir="2700000" w14:sx="100000" w14:sy="100000" w14:kx="0" w14:ky="0" w14:algn="tl">
+              <w14:schemeClr w14:val="dk1">
+                <w14:alpha w14:val="60000"/>
+              </w14:schemeClr>
+            </w14:shadow>
+            <w14:textOutline w14:w="0" w14:cap="flat" w14:cmpd="sng" w14:algn="ctr">
+              <w14:noFill/>
+              <w14:prstDash w14:val="solid"/>
+              <w14:round/>
+            </w14:textOutline>
           </w:rPr>
           <w:instrText xml:space="preserve"> TITLE \* MERGEFORMAT </w:instrText>
         </w:r>
         <w:r>
           <w:rPr>
-            <w:caps/>
-            <w:color w:val="156082" w:themeColor="accent1"/>
+            <w:color w:val="000000" w:themeColor="text1"/>
+            <w14:shadow w14:blurRad="38100" w14:dist="19050" w14:dir="2700000" w14:sx="100000" w14:sy="100000" w14:kx="0" w14:ky="0" w14:algn="tl">
+              <w14:schemeClr w14:val="dk1">
+                <w14:alpha w14:val="60000"/>
+              </w14:schemeClr>
+            </w14:shadow>
+            <w14:textOutline w14:w="0" w14:cap="flat" w14:cmpd="sng" w14:algn="ctr">
+              <w14:noFill/>
+              <w14:prstDash w14:val="solid"/>
+              <w14:round/>
+            </w14:textOutline>
           </w:rPr>
           <w:fldChar w:fldCharType="end"/>
         </w:r>
         <w:r>
           <w:rPr>
-            <w:caps/>
-            <w:color w:val="156082" w:themeColor="accent1"/>
+            <w:color w:val="000000" w:themeColor="text1"/>
+            <w14:shadow w14:blurRad="38100" w14:dist="19050" w14:dir="2700000" w14:sx="100000" w14:sy="100000" w14:kx="0" w14:ky="0" w14:algn="tl">
+              <w14:schemeClr w14:val="dk1">
+                <w14:alpha w14:val="60000"/>
+              </w14:schemeClr>
+            </w14:shadow>
+            <w14:textOutline w14:w="0" w14:cap="flat" w14:cmpd="sng" w14:algn="ctr">
+              <w14:noFill/>
+              <w14:prstDash w14:val="solid"/>
+              <w14:round/>
+            </w14:textOutline>
           </w:rPr>
           <w:t>PROJECT REPORT</w:t>
         </w:r>
@@ -31440,6 +31377,120 @@
       <w:lvlJc w:val="left"/>
     </w:lvl>
     <w:lvl w:ilvl="8" w:tplc="919478C4">
+      <w:numFmt w:val="decimal"/>
+      <w:lvlText w:val=""/>
+      <w:lvlJc w:val="left"/>
+    </w:lvl>
+  </w:abstractNum>
+  <w:abstractNum w:abstractNumId="30" w15:restartNumberingAfterBreak="0">
+    <w:nsid w:val="6DEF2CFF"/>
+    <w:multiLevelType w:val="hybridMultilevel"/>
+    <w:tmpl w:val="B67653F8"/>
+    <w:lvl w:ilvl="0" w:tplc="D50CDF82">
+      <w:start w:val="1"/>
+      <w:numFmt w:val="decimal"/>
+      <w:lvlText w:val="%1."/>
+      <w:lvlJc w:val="left"/>
+      <w:pPr>
+        <w:tabs>
+          <w:tab w:val="num" w:pos="900"/>
+        </w:tabs>
+        <w:ind w:left="540" w:hanging="360"/>
+      </w:pPr>
+    </w:lvl>
+    <w:lvl w:ilvl="1" w:tplc="16727D72">
+      <w:numFmt w:val="decimal"/>
+      <w:lvlText w:val=""/>
+      <w:lvlJc w:val="left"/>
+    </w:lvl>
+    <w:lvl w:ilvl="2" w:tplc="216EE670">
+      <w:numFmt w:val="decimal"/>
+      <w:lvlText w:val=""/>
+      <w:lvlJc w:val="left"/>
+    </w:lvl>
+    <w:lvl w:ilvl="3" w:tplc="E458C344">
+      <w:numFmt w:val="decimal"/>
+      <w:lvlText w:val=""/>
+      <w:lvlJc w:val="left"/>
+    </w:lvl>
+    <w:lvl w:ilvl="4" w:tplc="848A03D2">
+      <w:numFmt w:val="decimal"/>
+      <w:lvlText w:val=""/>
+      <w:lvlJc w:val="left"/>
+    </w:lvl>
+    <w:lvl w:ilvl="5" w:tplc="FCAC1B9A">
+      <w:numFmt w:val="decimal"/>
+      <w:lvlText w:val=""/>
+      <w:lvlJc w:val="left"/>
+    </w:lvl>
+    <w:lvl w:ilvl="6" w:tplc="258A69AE">
+      <w:numFmt w:val="decimal"/>
+      <w:lvlText w:val=""/>
+      <w:lvlJc w:val="left"/>
+    </w:lvl>
+    <w:lvl w:ilvl="7" w:tplc="AAA2AE46">
+      <w:numFmt w:val="decimal"/>
+      <w:lvlText w:val=""/>
+      <w:lvlJc w:val="left"/>
+    </w:lvl>
+    <w:lvl w:ilvl="8" w:tplc="3250B4DE">
+      <w:numFmt w:val="decimal"/>
+      <w:lvlText w:val=""/>
+      <w:lvlJc w:val="left"/>
+    </w:lvl>
+  </w:abstractNum>
+  <w:abstractNum w:abstractNumId="31" w15:restartNumberingAfterBreak="0">
+    <w:nsid w:val="6F9922BC"/>
+    <w:multiLevelType w:val="hybridMultilevel"/>
+    <w:tmpl w:val="864A2CE4"/>
+    <w:lvl w:ilvl="0" w:tplc="7DD01E48">
+      <w:start w:val="1"/>
+      <w:numFmt w:val="decimal"/>
+      <w:lvlText w:val="%1."/>
+      <w:lvlJc w:val="left"/>
+      <w:pPr>
+        <w:tabs>
+          <w:tab w:val="num" w:pos="900"/>
+        </w:tabs>
+        <w:ind w:left="540" w:hanging="360"/>
+      </w:pPr>
+    </w:lvl>
+    <w:lvl w:ilvl="1" w:tplc="34506FB2">
+      <w:numFmt w:val="decimal"/>
+      <w:lvlText w:val=""/>
+      <w:lvlJc w:val="left"/>
+    </w:lvl>
+    <w:lvl w:ilvl="2" w:tplc="7ECCF700">
+      <w:numFmt w:val="decimal"/>
+      <w:lvlText w:val=""/>
+      <w:lvlJc w:val="left"/>
+    </w:lvl>
+    <w:lvl w:ilvl="3" w:tplc="496C3532">
+      <w:numFmt w:val="decimal"/>
+      <w:lvlText w:val=""/>
+      <w:lvlJc w:val="left"/>
+    </w:lvl>
+    <w:lvl w:ilvl="4" w:tplc="32CC17EC">
+      <w:numFmt w:val="decimal"/>
+      <w:lvlText w:val=""/>
+      <w:lvlJc w:val="left"/>
+    </w:lvl>
+    <w:lvl w:ilvl="5" w:tplc="FE34B172">
+      <w:numFmt w:val="decimal"/>
+      <w:lvlText w:val=""/>
+      <w:lvlJc w:val="left"/>
+    </w:lvl>
+    <w:lvl w:ilvl="6" w:tplc="FD08AD46">
+      <w:numFmt w:val="decimal"/>
+      <w:lvlText w:val=""/>
+      <w:lvlJc w:val="left"/>
+    </w:lvl>
+    <w:lvl w:ilvl="7" w:tplc="0B6C68A2">
+      <w:numFmt w:val="decimal"/>
+      <w:lvlText w:val=""/>
+      <w:lvlJc w:val="left"/>
+    </w:lvl>
+    <w:lvl w:ilvl="8" w:tplc="B05E8ACE">
       <w:numFmt w:val="decimal"/>
       <w:lvlText w:val=""/>
       <w:lvlJc w:val="left"/>
@@ -31534,6 +31585,12 @@
   </w:num>
   <w:num w:numId="30" w16cid:durableId="1470513710">
     <w:abstractNumId w:val="0"/>
+  </w:num>
+  <w:num w:numId="31" w16cid:durableId="448203304">
+    <w:abstractNumId w:val="30"/>
+  </w:num>
+  <w:num w:numId="32" w16cid:durableId="768159448">
+    <w:abstractNumId w:val="31"/>
   </w:num>
 </w:numbering>
 </file>
@@ -32375,8 +32432,8 @@
   <w:rsids>
     <w:rsidRoot w:val="00D8007C"/>
     <w:rsid w:val="001B1405"/>
+    <w:rsid w:val="00B766F9"/>
     <w:rsid w:val="00D8007C"/>
-    <w:rsid w:val="00F74DD3"/>
   </w:rsids>
   <m:mathPr>
     <m:mathFont m:val="Cambria Math"/>
@@ -32835,6 +32892,10 @@
     <w:name w:val="64711AAFCC2FCB41A2944A1D9A86E85F"/>
     <w:rsid w:val="00D8007C"/>
   </w:style>
+  <w:style w:type="paragraph" w:customStyle="1" w:styleId="D3D400E885578440BBA7E08158A12025">
+    <w:name w:val="D3D400E885578440BBA7E08158A12025"/>
+    <w:rsid w:val="00D8007C"/>
+  </w:style>
 </w:styles>
 </file>
 

</xml_diff>